<commit_message>
feat: Add final submission package including README, report update guide, and submission checklist
- Created README_SUBMISSION.md detailing project summary, submission package contents, analysis highlights, key findings, and final checklist for submission readiness.
- Added REPORT_UPDATE_GUIDE.md with specific text replacements for the main report to ensure accuracy and completeness.
- Introduced SUBMISSION_CHECKLIST.md to outline deliverables, notebook completion status, key metrics summary, and critical corrections made during the project.
</commit_message>
<xml_diff>
--- a/ISYS2047-assignment-3.docx
+++ b/ISYS2047-assignment-3.docx
@@ -1250,6 +1250,8 @@
       <w:bookmarkStart w:id="1" w:name="OLE_LINK2"/>
       <w:bookmarkStart w:id="2" w:name="OLE_LINK3"/>
       <w:bookmarkStart w:id="3" w:name="OLE_LINK4"/>
+      <w:bookmarkStart w:id="4" w:name="OLE_LINK5"/>
+      <w:bookmarkStart w:id="5" w:name="OLE_LINK6"/>
       <w:r>
         <w:rPr>
           <w:rStyle w:val="Strong"/>
@@ -1760,6 +1762,8 @@
     <w:p/>
     <w:p/>
     <w:p/>
+    <w:bookmarkEnd w:id="4"/>
+    <w:bookmarkEnd w:id="5"/>
     <w:p/>
     <w:p/>
     <w:p/>
@@ -1797,7 +1801,7 @@
           <w:rFonts w:ascii="Times New Roman" w:hAnsi="Times New Roman" w:cs="Times New Roman"/>
         </w:rPr>
       </w:pPr>
-      <w:bookmarkStart w:id="4" w:name="_Toc231052937"/>
+      <w:bookmarkStart w:id="6" w:name="_Toc231052937"/>
       <w:r>
         <w:rPr>
           <w:rFonts w:ascii="Times New Roman" w:hAnsi="Times New Roman" w:cs="Times New Roman"/>
@@ -1805,7 +1809,7 @@
         <w:lastRenderedPageBreak/>
         <w:t>References</w:t>
       </w:r>
-      <w:bookmarkEnd w:id="4"/>
+      <w:bookmarkEnd w:id="6"/>
     </w:p>
     <w:p>
       <w:pPr>
@@ -4720,6 +4724,7 @@
   </w:compat>
   <w:rsids>
     <w:rsidRoot w:val="008D3304"/>
+    <w:rsid w:val="001814C7"/>
     <w:rsid w:val="00191BCA"/>
     <w:rsid w:val="003E3EBB"/>
     <w:rsid w:val="00757EF4"/>
@@ -4727,7 +4732,6 @@
     <w:rsid w:val="008D3304"/>
     <w:rsid w:val="0095584E"/>
     <w:rsid w:val="00972862"/>
-    <w:rsid w:val="009D08AB"/>
   </w:rsids>
   <m:mathPr>
     <m:mathFont m:val="Cambria Math"/>

</xml_diff>

<commit_message>
complete redraft and improved for final
</commit_message>
<xml_diff>
--- a/ISYS2047-assignment-3.docx
+++ b/ISYS2047-assignment-3.docx
@@ -3,23 +3,12 @@
 <w:document xmlns:wpc="http://schemas.microsoft.com/office/word/2010/wordprocessingCanvas" xmlns:cx="http://schemas.microsoft.com/office/drawing/2014/chartex" xmlns:cx1="http://schemas.microsoft.com/office/drawing/2015/9/8/chartex" xmlns:cx2="http://schemas.microsoft.com/office/drawing/2015/10/21/chartex" xmlns:cx3="http://schemas.microsoft.com/office/drawing/2016/5/9/chartex" xmlns:cx4="http://schemas.microsoft.com/office/drawing/2016/5/10/chartex" xmlns:cx5="http://schemas.microsoft.com/office/drawing/2016/5/11/chartex" xmlns:cx6="http://schemas.microsoft.com/office/drawing/2016/5/12/chartex" xmlns:cx7="http://schemas.microsoft.com/office/drawing/2016/5/13/chartex" xmlns:cx8="http://schemas.microsoft.com/office/drawing/2016/5/14/chartex" xmlns:mc="http://schemas.openxmlformats.org/markup-compatibility/2006" xmlns:aink="http://schemas.microsoft.com/office/drawing/2016/ink" xmlns:am3d="http://schemas.microsoft.com/office/drawing/2017/model3d" xmlns:o="urn:schemas-microsoft-com:office:office" xmlns:oel="http://schemas.microsoft.com/office/2019/extlst" xmlns:r="http://schemas.openxmlformats.org/officeDocument/2006/relationships" xmlns:m="http://schemas.openxmlformats.org/officeDocument/2006/math" xmlns:v="urn:schemas-microsoft-com:vml" xmlns:wp14="http://schemas.microsoft.com/office/word/2010/wordprocessingDrawing" xmlns:wp="http://schemas.openxmlformats.org/drawingml/2006/wordprocessingDrawing" xmlns:w10="urn:schemas-microsoft-com:office:word" xmlns:w="http://schemas.openxmlformats.org/wordprocessingml/2006/main" xmlns:w14="http://schemas.microsoft.com/office/word/2010/wordml" xmlns:w15="http://schemas.microsoft.com/office/word/2012/wordml" xmlns:w16cex="http://schemas.microsoft.com/office/word/2018/wordml/cex" xmlns:w16cid="http://schemas.microsoft.com/office/word/2016/wordml/cid" xmlns:w16="http://schemas.microsoft.com/office/word/2018/wordml" xmlns:w16du="http://schemas.microsoft.com/office/word/2023/wordml/word16du" xmlns:w16sdtdh="http://schemas.microsoft.com/office/word/2020/wordml/sdtdatahash" xmlns:w16se="http://schemas.microsoft.com/office/word/2015/wordml/symex" xmlns:wpg="http://schemas.microsoft.com/office/word/2010/wordprocessingGroup" xmlns:wpi="http://schemas.microsoft.com/office/word/2010/wordprocessingInk" xmlns:wne="http://schemas.microsoft.com/office/word/2006/wordml" xmlns:wps="http://schemas.microsoft.com/office/word/2010/wordprocessingShape" mc:Ignorable="w14 w15 w16se w16cid w16 w16cex w16sdtdh w16du wp14">
   <w:body>
     <w:p>
-      <w:pPr>
-        <w:rPr>
-          <w:rFonts w:ascii="Times New Roman" w:hAnsi="Times New Roman" w:cs="Times New Roman"/>
-        </w:rPr>
-      </w:pPr>
-      <w:r>
-        <w:rPr>
-          <w:rFonts w:ascii="Times New Roman" w:hAnsi="Times New Roman" w:cs="Times New Roman"/>
-        </w:rPr>
+      <w:r>
         <w:t>ISYS2047-assignment-3</w:t>
       </w:r>
     </w:p>
     <w:sdt>
       <w:sdtPr>
-        <w:rPr>
-          <w:rFonts w:ascii="Times New Roman" w:hAnsi="Times New Roman" w:cs="Times New Roman"/>
-        </w:rPr>
         <w:id w:val="-1079517864"/>
         <w:docPartObj>
           <w:docPartGallery w:val="Cover Pages"/>
@@ -28,14 +17,8 @@
       </w:sdtPr>
       <w:sdtContent>
         <w:p>
-          <w:pPr>
-            <w:rPr>
-              <w:rFonts w:ascii="Times New Roman" w:hAnsi="Times New Roman" w:cs="Times New Roman"/>
-            </w:rPr>
-          </w:pPr>
           <w:r>
             <w:rPr>
-              <w:rFonts w:ascii="Times New Roman" w:hAnsi="Times New Roman" w:cs="Times New Roman"/>
               <w:noProof/>
             </w:rPr>
             <mc:AlternateContent>
@@ -304,7 +287,6 @@
           </w:r>
           <w:r>
             <w:rPr>
-              <w:rFonts w:ascii="Times New Roman" w:hAnsi="Times New Roman" w:cs="Times New Roman"/>
               <w:noProof/>
             </w:rPr>
             <mc:AlternateContent>
@@ -475,7 +457,6 @@
           </w:r>
           <w:r>
             <w:rPr>
-              <w:rFonts w:ascii="Times New Roman" w:hAnsi="Times New Roman" w:cs="Times New Roman"/>
               <w:noProof/>
             </w:rPr>
             <mc:AlternateContent>
@@ -714,7 +695,6 @@
           </w:r>
           <w:r>
             <w:rPr>
-              <w:rFonts w:ascii="Times New Roman" w:hAnsi="Times New Roman" w:cs="Times New Roman"/>
               <w:noProof/>
             </w:rPr>
             <mc:AlternateContent>
@@ -953,15 +933,7 @@
           </w:r>
         </w:p>
         <w:p>
-          <w:pPr>
-            <w:rPr>
-              <w:rFonts w:ascii="Times New Roman" w:hAnsi="Times New Roman" w:cs="Times New Roman"/>
-            </w:rPr>
-          </w:pPr>
           <w:r>
-            <w:rPr>
-              <w:rFonts w:ascii="Times New Roman" w:hAnsi="Times New Roman" w:cs="Times New Roman"/>
-            </w:rPr>
             <w:br w:type="page"/>
           </w:r>
         </w:p>
@@ -977,21 +949,13 @@
       </w:sdtPr>
       <w:sdtEndPr>
         <w:rPr>
-          <w:rFonts w:asciiTheme="minorHAnsi" w:eastAsiaTheme="minorHAnsi" w:hAnsiTheme="minorHAnsi" w:cstheme="minorBidi"/>
+          <w:b/>
+          <w:bCs/>
           <w:noProof/>
-          <w:color w:val="auto"/>
-          <w:kern w:val="2"/>
-          <w:sz w:val="24"/>
-          <w:szCs w:val="24"/>
-          <w:lang w:val="en-AU"/>
-          <w14:ligatures w14:val="standardContextual"/>
         </w:rPr>
       </w:sdtEndPr>
       <w:sdtContent>
         <w:p>
-          <w:pPr>
-            <w:pStyle w:val="TOCHeading"/>
-          </w:pPr>
           <w:r>
             <w:t>Table of Contents</w:t>
           </w:r>
@@ -1014,30 +978,21 @@
             </w:rPr>
           </w:pPr>
           <w:r>
-            <w:rPr>
-              <w:b w:val="0"/>
-              <w:bCs w:val="0"/>
-            </w:rPr>
             <w:fldChar w:fldCharType="begin"/>
           </w:r>
           <w:r>
             <w:instrText xml:space="preserve"> TOC \o "1-3" \h \z \u </w:instrText>
           </w:r>
           <w:r>
-            <w:rPr>
-              <w:b w:val="0"/>
-              <w:bCs w:val="0"/>
-            </w:rPr>
             <w:fldChar w:fldCharType="separate"/>
           </w:r>
-          <w:hyperlink w:anchor="_Toc231052936" w:history="1">
+          <w:hyperlink w:anchor="_Toc231103995" w:history="1">
             <w:r>
               <w:rPr>
                 <w:rStyle w:val="Hyperlink"/>
-                <w:rFonts w:ascii="Times New Roman" w:hAnsi="Times New Roman" w:cs="Times New Roman"/>
-                <w:noProof/>
-              </w:rPr>
-              <w:t>2</w:t>
+                <w:noProof/>
+              </w:rPr>
+              <w:t>1</w:t>
             </w:r>
             <w:r>
               <w:rPr>
@@ -1054,10 +1009,9 @@
             <w:r>
               <w:rPr>
                 <w:rStyle w:val="Hyperlink"/>
-                <w:rFonts w:ascii="Times New Roman" w:hAnsi="Times New Roman" w:cs="Times New Roman"/>
-                <w:noProof/>
-              </w:rPr>
-              <w:t>Task B.1</w:t>
+                <w:noProof/>
+              </w:rPr>
+              <w:t>Business Understanding</w:t>
             </w:r>
             <w:r>
               <w:rPr>
@@ -1078,7 +1032,289 @@
                 <w:noProof/>
                 <w:webHidden/>
               </w:rPr>
-              <w:instrText xml:space="preserve"> PAGEREF _Toc231052936 \h </w:instrText>
+              <w:instrText xml:space="preserve"> PAGEREF _Toc231103995 \h </w:instrText>
+            </w:r>
+            <w:r>
+              <w:rPr>
+                <w:noProof/>
+                <w:webHidden/>
+              </w:rPr>
+            </w:r>
+            <w:r>
+              <w:rPr>
+                <w:noProof/>
+                <w:webHidden/>
+              </w:rPr>
+              <w:fldChar w:fldCharType="separate"/>
+            </w:r>
+            <w:r>
+              <w:rPr>
+                <w:noProof/>
+                <w:webHidden/>
+              </w:rPr>
+              <w:t>2</w:t>
+            </w:r>
+            <w:r>
+              <w:rPr>
+                <w:noProof/>
+                <w:webHidden/>
+              </w:rPr>
+              <w:fldChar w:fldCharType="end"/>
+            </w:r>
+          </w:hyperlink>
+        </w:p>
+        <w:p>
+          <w:pPr>
+            <w:pStyle w:val="TOC2"/>
+            <w:tabs>
+              <w:tab w:val="left" w:pos="960"/>
+              <w:tab w:val="right" w:leader="dot" w:pos="9016"/>
+            </w:tabs>
+            <w:rPr>
+              <w:rFonts w:eastAsiaTheme="minorEastAsia"/>
+              <w:b w:val="0"/>
+              <w:bCs w:val="0"/>
+              <w:noProof/>
+              <w:sz w:val="24"/>
+              <w:szCs w:val="24"/>
+              <w:lang w:eastAsia="en-GB"/>
+            </w:rPr>
+          </w:pPr>
+          <w:hyperlink w:anchor="_Toc231103996" w:history="1">
+            <w:r>
+              <w:rPr>
+                <w:rStyle w:val="Hyperlink"/>
+                <w:noProof/>
+              </w:rPr>
+              <w:t>1.1</w:t>
+            </w:r>
+            <w:r>
+              <w:rPr>
+                <w:rFonts w:eastAsiaTheme="minorEastAsia"/>
+                <w:b w:val="0"/>
+                <w:bCs w:val="0"/>
+                <w:noProof/>
+                <w:sz w:val="24"/>
+                <w:szCs w:val="24"/>
+                <w:lang w:eastAsia="en-GB"/>
+              </w:rPr>
+              <w:tab/>
+            </w:r>
+            <w:r>
+              <w:rPr>
+                <w:rStyle w:val="Hyperlink"/>
+                <w:noProof/>
+              </w:rPr>
+              <w:t>The Business Problem</w:t>
+            </w:r>
+            <w:r>
+              <w:rPr>
+                <w:noProof/>
+                <w:webHidden/>
+              </w:rPr>
+              <w:tab/>
+            </w:r>
+            <w:r>
+              <w:rPr>
+                <w:noProof/>
+                <w:webHidden/>
+              </w:rPr>
+              <w:fldChar w:fldCharType="begin"/>
+            </w:r>
+            <w:r>
+              <w:rPr>
+                <w:noProof/>
+                <w:webHidden/>
+              </w:rPr>
+              <w:instrText xml:space="preserve"> PAGEREF _Toc231103996 \h </w:instrText>
+            </w:r>
+            <w:r>
+              <w:rPr>
+                <w:noProof/>
+                <w:webHidden/>
+              </w:rPr>
+            </w:r>
+            <w:r>
+              <w:rPr>
+                <w:noProof/>
+                <w:webHidden/>
+              </w:rPr>
+              <w:fldChar w:fldCharType="separate"/>
+            </w:r>
+            <w:r>
+              <w:rPr>
+                <w:noProof/>
+                <w:webHidden/>
+              </w:rPr>
+              <w:t>2</w:t>
+            </w:r>
+            <w:r>
+              <w:rPr>
+                <w:noProof/>
+                <w:webHidden/>
+              </w:rPr>
+              <w:fldChar w:fldCharType="end"/>
+            </w:r>
+          </w:hyperlink>
+        </w:p>
+        <w:p>
+          <w:pPr>
+            <w:pStyle w:val="TOC2"/>
+            <w:tabs>
+              <w:tab w:val="left" w:pos="960"/>
+              <w:tab w:val="right" w:leader="dot" w:pos="9016"/>
+            </w:tabs>
+            <w:rPr>
+              <w:rFonts w:eastAsiaTheme="minorEastAsia"/>
+              <w:b w:val="0"/>
+              <w:bCs w:val="0"/>
+              <w:noProof/>
+              <w:sz w:val="24"/>
+              <w:szCs w:val="24"/>
+              <w:lang w:eastAsia="en-GB"/>
+            </w:rPr>
+          </w:pPr>
+          <w:hyperlink w:anchor="_Toc231103997" w:history="1">
+            <w:r>
+              <w:rPr>
+                <w:rStyle w:val="Hyperlink"/>
+                <w:noProof/>
+              </w:rPr>
+              <w:t>1.2</w:t>
+            </w:r>
+            <w:r>
+              <w:rPr>
+                <w:rFonts w:eastAsiaTheme="minorEastAsia"/>
+                <w:b w:val="0"/>
+                <w:bCs w:val="0"/>
+                <w:noProof/>
+                <w:sz w:val="24"/>
+                <w:szCs w:val="24"/>
+                <w:lang w:eastAsia="en-GB"/>
+              </w:rPr>
+              <w:tab/>
+            </w:r>
+            <w:r>
+              <w:rPr>
+                <w:rStyle w:val="Hyperlink"/>
+                <w:noProof/>
+              </w:rPr>
+              <w:t>Data Science Problem Definition</w:t>
+            </w:r>
+            <w:r>
+              <w:rPr>
+                <w:noProof/>
+                <w:webHidden/>
+              </w:rPr>
+              <w:tab/>
+            </w:r>
+            <w:r>
+              <w:rPr>
+                <w:noProof/>
+                <w:webHidden/>
+              </w:rPr>
+              <w:fldChar w:fldCharType="begin"/>
+            </w:r>
+            <w:r>
+              <w:rPr>
+                <w:noProof/>
+                <w:webHidden/>
+              </w:rPr>
+              <w:instrText xml:space="preserve"> PAGEREF _Toc231103997 \h </w:instrText>
+            </w:r>
+            <w:r>
+              <w:rPr>
+                <w:noProof/>
+                <w:webHidden/>
+              </w:rPr>
+            </w:r>
+            <w:r>
+              <w:rPr>
+                <w:noProof/>
+                <w:webHidden/>
+              </w:rPr>
+              <w:fldChar w:fldCharType="separate"/>
+            </w:r>
+            <w:r>
+              <w:rPr>
+                <w:noProof/>
+                <w:webHidden/>
+              </w:rPr>
+              <w:t>2</w:t>
+            </w:r>
+            <w:r>
+              <w:rPr>
+                <w:noProof/>
+                <w:webHidden/>
+              </w:rPr>
+              <w:fldChar w:fldCharType="end"/>
+            </w:r>
+          </w:hyperlink>
+        </w:p>
+        <w:p>
+          <w:pPr>
+            <w:pStyle w:val="TOC2"/>
+            <w:tabs>
+              <w:tab w:val="left" w:pos="960"/>
+              <w:tab w:val="right" w:leader="dot" w:pos="9016"/>
+            </w:tabs>
+            <w:rPr>
+              <w:rFonts w:eastAsiaTheme="minorEastAsia"/>
+              <w:b w:val="0"/>
+              <w:bCs w:val="0"/>
+              <w:noProof/>
+              <w:sz w:val="24"/>
+              <w:szCs w:val="24"/>
+              <w:lang w:eastAsia="en-GB"/>
+            </w:rPr>
+          </w:pPr>
+          <w:hyperlink w:anchor="_Toc231103998" w:history="1">
+            <w:r>
+              <w:rPr>
+                <w:rStyle w:val="Hyperlink"/>
+                <w:noProof/>
+              </w:rPr>
+              <w:t>1.3</w:t>
+            </w:r>
+            <w:r>
+              <w:rPr>
+                <w:rFonts w:eastAsiaTheme="minorEastAsia"/>
+                <w:b w:val="0"/>
+                <w:bCs w:val="0"/>
+                <w:noProof/>
+                <w:sz w:val="24"/>
+                <w:szCs w:val="24"/>
+                <w:lang w:eastAsia="en-GB"/>
+              </w:rPr>
+              <w:tab/>
+            </w:r>
+            <w:r>
+              <w:rPr>
+                <w:rStyle w:val="Hyperlink"/>
+                <w:noProof/>
+              </w:rPr>
+              <w:t>Methodology</w:t>
+            </w:r>
+            <w:r>
+              <w:rPr>
+                <w:noProof/>
+                <w:webHidden/>
+              </w:rPr>
+              <w:tab/>
+            </w:r>
+            <w:r>
+              <w:rPr>
+                <w:noProof/>
+                <w:webHidden/>
+              </w:rPr>
+              <w:fldChar w:fldCharType="begin"/>
+            </w:r>
+            <w:r>
+              <w:rPr>
+                <w:noProof/>
+                <w:webHidden/>
+              </w:rPr>
+              <w:instrText xml:space="preserve"> PAGEREF _Toc231103998 \h </w:instrText>
             </w:r>
             <w:r>
               <w:rPr>
@@ -1126,14 +1362,13 @@
               <w:lang w:eastAsia="en-GB"/>
             </w:rPr>
           </w:pPr>
-          <w:hyperlink w:anchor="_Toc231052937" w:history="1">
+          <w:hyperlink w:anchor="_Toc231103999" w:history="1">
             <w:r>
               <w:rPr>
                 <w:rStyle w:val="Hyperlink"/>
-                <w:rFonts w:ascii="Times New Roman" w:hAnsi="Times New Roman" w:cs="Times New Roman"/>
-                <w:noProof/>
-              </w:rPr>
-              <w:t>3</w:t>
+                <w:noProof/>
+              </w:rPr>
+              <w:t>2</w:t>
             </w:r>
             <w:r>
               <w:rPr>
@@ -1150,10 +1385,9 @@
             <w:r>
               <w:rPr>
                 <w:rStyle w:val="Hyperlink"/>
-                <w:rFonts w:ascii="Times New Roman" w:hAnsi="Times New Roman" w:cs="Times New Roman"/>
-                <w:noProof/>
-              </w:rPr>
-              <w:t>References</w:t>
+                <w:noProof/>
+              </w:rPr>
+              <w:t>Data Understanding</w:t>
             </w:r>
             <w:r>
               <w:rPr>
@@ -1174,7 +1408,7 @@
                 <w:noProof/>
                 <w:webHidden/>
               </w:rPr>
-              <w:instrText xml:space="preserve"> PAGEREF _Toc231052937 \h </w:instrText>
+              <w:instrText xml:space="preserve"> PAGEREF _Toc231103999 \h </w:instrText>
             </w:r>
             <w:r>
               <w:rPr>
@@ -1194,7 +1428,853 @@
                 <w:noProof/>
                 <w:webHidden/>
               </w:rPr>
+              <w:t>2</w:t>
+            </w:r>
+            <w:r>
+              <w:rPr>
+                <w:noProof/>
+                <w:webHidden/>
+              </w:rPr>
+              <w:fldChar w:fldCharType="end"/>
+            </w:r>
+          </w:hyperlink>
+        </w:p>
+        <w:p>
+          <w:pPr>
+            <w:pStyle w:val="TOC1"/>
+            <w:tabs>
+              <w:tab w:val="left" w:pos="480"/>
+              <w:tab w:val="right" w:leader="dot" w:pos="9016"/>
+            </w:tabs>
+            <w:rPr>
+              <w:rFonts w:eastAsiaTheme="minorEastAsia"/>
+              <w:b w:val="0"/>
+              <w:bCs w:val="0"/>
+              <w:i w:val="0"/>
+              <w:iCs w:val="0"/>
+              <w:noProof/>
+              <w:lang w:eastAsia="en-GB"/>
+            </w:rPr>
+          </w:pPr>
+          <w:hyperlink w:anchor="_Toc231104000" w:history="1">
+            <w:r>
+              <w:rPr>
+                <w:rStyle w:val="Hyperlink"/>
+                <w:noProof/>
+              </w:rPr>
               <w:t>3</w:t>
+            </w:r>
+            <w:r>
+              <w:rPr>
+                <w:rFonts w:eastAsiaTheme="minorEastAsia"/>
+                <w:b w:val="0"/>
+                <w:bCs w:val="0"/>
+                <w:i w:val="0"/>
+                <w:iCs w:val="0"/>
+                <w:noProof/>
+                <w:lang w:eastAsia="en-GB"/>
+              </w:rPr>
+              <w:tab/>
+            </w:r>
+            <w:r>
+              <w:rPr>
+                <w:rStyle w:val="Hyperlink"/>
+                <w:noProof/>
+              </w:rPr>
+              <w:t>Data Preparation</w:t>
+            </w:r>
+            <w:r>
+              <w:rPr>
+                <w:noProof/>
+                <w:webHidden/>
+              </w:rPr>
+              <w:tab/>
+            </w:r>
+            <w:r>
+              <w:rPr>
+                <w:noProof/>
+                <w:webHidden/>
+              </w:rPr>
+              <w:fldChar w:fldCharType="begin"/>
+            </w:r>
+            <w:r>
+              <w:rPr>
+                <w:noProof/>
+                <w:webHidden/>
+              </w:rPr>
+              <w:instrText xml:space="preserve"> PAGEREF _Toc231104000 \h </w:instrText>
+            </w:r>
+            <w:r>
+              <w:rPr>
+                <w:noProof/>
+                <w:webHidden/>
+              </w:rPr>
+            </w:r>
+            <w:r>
+              <w:rPr>
+                <w:noProof/>
+                <w:webHidden/>
+              </w:rPr>
+              <w:fldChar w:fldCharType="separate"/>
+            </w:r>
+            <w:r>
+              <w:rPr>
+                <w:noProof/>
+                <w:webHidden/>
+              </w:rPr>
+              <w:t>3</w:t>
+            </w:r>
+            <w:r>
+              <w:rPr>
+                <w:noProof/>
+                <w:webHidden/>
+              </w:rPr>
+              <w:fldChar w:fldCharType="end"/>
+            </w:r>
+          </w:hyperlink>
+        </w:p>
+        <w:p>
+          <w:pPr>
+            <w:pStyle w:val="TOC1"/>
+            <w:tabs>
+              <w:tab w:val="left" w:pos="480"/>
+              <w:tab w:val="right" w:leader="dot" w:pos="9016"/>
+            </w:tabs>
+            <w:rPr>
+              <w:rFonts w:eastAsiaTheme="minorEastAsia"/>
+              <w:b w:val="0"/>
+              <w:bCs w:val="0"/>
+              <w:i w:val="0"/>
+              <w:iCs w:val="0"/>
+              <w:noProof/>
+              <w:lang w:eastAsia="en-GB"/>
+            </w:rPr>
+          </w:pPr>
+          <w:hyperlink w:anchor="_Toc231104001" w:history="1">
+            <w:r>
+              <w:rPr>
+                <w:rStyle w:val="Hyperlink"/>
+                <w:noProof/>
+              </w:rPr>
+              <w:t>4</w:t>
+            </w:r>
+            <w:r>
+              <w:rPr>
+                <w:rFonts w:eastAsiaTheme="minorEastAsia"/>
+                <w:b w:val="0"/>
+                <w:bCs w:val="0"/>
+                <w:i w:val="0"/>
+                <w:iCs w:val="0"/>
+                <w:noProof/>
+                <w:lang w:eastAsia="en-GB"/>
+              </w:rPr>
+              <w:tab/>
+            </w:r>
+            <w:r>
+              <w:rPr>
+                <w:rStyle w:val="Hyperlink"/>
+                <w:noProof/>
+              </w:rPr>
+              <w:t>Modelling</w:t>
+            </w:r>
+            <w:r>
+              <w:rPr>
+                <w:noProof/>
+                <w:webHidden/>
+              </w:rPr>
+              <w:tab/>
+            </w:r>
+            <w:r>
+              <w:rPr>
+                <w:noProof/>
+                <w:webHidden/>
+              </w:rPr>
+              <w:fldChar w:fldCharType="begin"/>
+            </w:r>
+            <w:r>
+              <w:rPr>
+                <w:noProof/>
+                <w:webHidden/>
+              </w:rPr>
+              <w:instrText xml:space="preserve"> PAGEREF _Toc231104001 \h </w:instrText>
+            </w:r>
+            <w:r>
+              <w:rPr>
+                <w:noProof/>
+                <w:webHidden/>
+              </w:rPr>
+            </w:r>
+            <w:r>
+              <w:rPr>
+                <w:noProof/>
+                <w:webHidden/>
+              </w:rPr>
+              <w:fldChar w:fldCharType="separate"/>
+            </w:r>
+            <w:r>
+              <w:rPr>
+                <w:noProof/>
+                <w:webHidden/>
+              </w:rPr>
+              <w:t>3</w:t>
+            </w:r>
+            <w:r>
+              <w:rPr>
+                <w:noProof/>
+                <w:webHidden/>
+              </w:rPr>
+              <w:fldChar w:fldCharType="end"/>
+            </w:r>
+          </w:hyperlink>
+        </w:p>
+        <w:p>
+          <w:pPr>
+            <w:pStyle w:val="TOC2"/>
+            <w:tabs>
+              <w:tab w:val="left" w:pos="960"/>
+              <w:tab w:val="right" w:leader="dot" w:pos="9016"/>
+            </w:tabs>
+            <w:rPr>
+              <w:rFonts w:eastAsiaTheme="minorEastAsia"/>
+              <w:b w:val="0"/>
+              <w:bCs w:val="0"/>
+              <w:noProof/>
+              <w:sz w:val="24"/>
+              <w:szCs w:val="24"/>
+              <w:lang w:eastAsia="en-GB"/>
+            </w:rPr>
+          </w:pPr>
+          <w:hyperlink w:anchor="_Toc231104002" w:history="1">
+            <w:r>
+              <w:rPr>
+                <w:rStyle w:val="Hyperlink"/>
+                <w:noProof/>
+              </w:rPr>
+              <w:t>4.1</w:t>
+            </w:r>
+            <w:r>
+              <w:rPr>
+                <w:rFonts w:eastAsiaTheme="minorEastAsia"/>
+                <w:b w:val="0"/>
+                <w:bCs w:val="0"/>
+                <w:noProof/>
+                <w:sz w:val="24"/>
+                <w:szCs w:val="24"/>
+                <w:lang w:eastAsia="en-GB"/>
+              </w:rPr>
+              <w:tab/>
+            </w:r>
+            <w:r>
+              <w:rPr>
+                <w:rStyle w:val="Hyperlink"/>
+                <w:noProof/>
+              </w:rPr>
+              <w:t>Data Pipeline and Train/Test Split</w:t>
+            </w:r>
+            <w:r>
+              <w:rPr>
+                <w:noProof/>
+                <w:webHidden/>
+              </w:rPr>
+              <w:tab/>
+            </w:r>
+            <w:r>
+              <w:rPr>
+                <w:noProof/>
+                <w:webHidden/>
+              </w:rPr>
+              <w:fldChar w:fldCharType="begin"/>
+            </w:r>
+            <w:r>
+              <w:rPr>
+                <w:noProof/>
+                <w:webHidden/>
+              </w:rPr>
+              <w:instrText xml:space="preserve"> PAGEREF _Toc231104002 \h </w:instrText>
+            </w:r>
+            <w:r>
+              <w:rPr>
+                <w:noProof/>
+                <w:webHidden/>
+              </w:rPr>
+            </w:r>
+            <w:r>
+              <w:rPr>
+                <w:noProof/>
+                <w:webHidden/>
+              </w:rPr>
+              <w:fldChar w:fldCharType="separate"/>
+            </w:r>
+            <w:r>
+              <w:rPr>
+                <w:noProof/>
+                <w:webHidden/>
+              </w:rPr>
+              <w:t>3</w:t>
+            </w:r>
+            <w:r>
+              <w:rPr>
+                <w:noProof/>
+                <w:webHidden/>
+              </w:rPr>
+              <w:fldChar w:fldCharType="end"/>
+            </w:r>
+          </w:hyperlink>
+        </w:p>
+        <w:p>
+          <w:pPr>
+            <w:pStyle w:val="TOC2"/>
+            <w:tabs>
+              <w:tab w:val="left" w:pos="960"/>
+              <w:tab w:val="right" w:leader="dot" w:pos="9016"/>
+            </w:tabs>
+            <w:rPr>
+              <w:rFonts w:eastAsiaTheme="minorEastAsia"/>
+              <w:b w:val="0"/>
+              <w:bCs w:val="0"/>
+              <w:noProof/>
+              <w:sz w:val="24"/>
+              <w:szCs w:val="24"/>
+              <w:lang w:eastAsia="en-GB"/>
+            </w:rPr>
+          </w:pPr>
+          <w:hyperlink w:anchor="_Toc231104003" w:history="1">
+            <w:r>
+              <w:rPr>
+                <w:rStyle w:val="Hyperlink"/>
+                <w:noProof/>
+              </w:rPr>
+              <w:t>4.2</w:t>
+            </w:r>
+            <w:r>
+              <w:rPr>
+                <w:rFonts w:eastAsiaTheme="minorEastAsia"/>
+                <w:b w:val="0"/>
+                <w:bCs w:val="0"/>
+                <w:noProof/>
+                <w:sz w:val="24"/>
+                <w:szCs w:val="24"/>
+                <w:lang w:eastAsia="en-GB"/>
+              </w:rPr>
+              <w:tab/>
+            </w:r>
+            <w:r>
+              <w:rPr>
+                <w:rStyle w:val="Hyperlink"/>
+                <w:noProof/>
+              </w:rPr>
+              <w:t>Baseline Models</w:t>
+            </w:r>
+            <w:r>
+              <w:rPr>
+                <w:noProof/>
+                <w:webHidden/>
+              </w:rPr>
+              <w:tab/>
+            </w:r>
+            <w:r>
+              <w:rPr>
+                <w:noProof/>
+                <w:webHidden/>
+              </w:rPr>
+              <w:fldChar w:fldCharType="begin"/>
+            </w:r>
+            <w:r>
+              <w:rPr>
+                <w:noProof/>
+                <w:webHidden/>
+              </w:rPr>
+              <w:instrText xml:space="preserve"> PAGEREF _Toc231104003 \h </w:instrText>
+            </w:r>
+            <w:r>
+              <w:rPr>
+                <w:noProof/>
+                <w:webHidden/>
+              </w:rPr>
+            </w:r>
+            <w:r>
+              <w:rPr>
+                <w:noProof/>
+                <w:webHidden/>
+              </w:rPr>
+              <w:fldChar w:fldCharType="separate"/>
+            </w:r>
+            <w:r>
+              <w:rPr>
+                <w:noProof/>
+                <w:webHidden/>
+              </w:rPr>
+              <w:t>4</w:t>
+            </w:r>
+            <w:r>
+              <w:rPr>
+                <w:noProof/>
+                <w:webHidden/>
+              </w:rPr>
+              <w:fldChar w:fldCharType="end"/>
+            </w:r>
+          </w:hyperlink>
+        </w:p>
+        <w:p>
+          <w:pPr>
+            <w:pStyle w:val="TOC2"/>
+            <w:tabs>
+              <w:tab w:val="left" w:pos="960"/>
+              <w:tab w:val="right" w:leader="dot" w:pos="9016"/>
+            </w:tabs>
+            <w:rPr>
+              <w:rFonts w:eastAsiaTheme="minorEastAsia"/>
+              <w:b w:val="0"/>
+              <w:bCs w:val="0"/>
+              <w:noProof/>
+              <w:sz w:val="24"/>
+              <w:szCs w:val="24"/>
+              <w:lang w:eastAsia="en-GB"/>
+            </w:rPr>
+          </w:pPr>
+          <w:hyperlink w:anchor="_Toc231104004" w:history="1">
+            <w:r>
+              <w:rPr>
+                <w:rStyle w:val="Hyperlink"/>
+                <w:noProof/>
+              </w:rPr>
+              <w:t>4.3</w:t>
+            </w:r>
+            <w:r>
+              <w:rPr>
+                <w:rFonts w:eastAsiaTheme="minorEastAsia"/>
+                <w:b w:val="0"/>
+                <w:bCs w:val="0"/>
+                <w:noProof/>
+                <w:sz w:val="24"/>
+                <w:szCs w:val="24"/>
+                <w:lang w:eastAsia="en-GB"/>
+              </w:rPr>
+              <w:tab/>
+            </w:r>
+            <w:r>
+              <w:rPr>
+                <w:rStyle w:val="Hyperlink"/>
+                <w:noProof/>
+              </w:rPr>
+              <w:t>Hyperparameter Tuning</w:t>
+            </w:r>
+            <w:r>
+              <w:rPr>
+                <w:noProof/>
+                <w:webHidden/>
+              </w:rPr>
+              <w:tab/>
+            </w:r>
+            <w:r>
+              <w:rPr>
+                <w:noProof/>
+                <w:webHidden/>
+              </w:rPr>
+              <w:fldChar w:fldCharType="begin"/>
+            </w:r>
+            <w:r>
+              <w:rPr>
+                <w:noProof/>
+                <w:webHidden/>
+              </w:rPr>
+              <w:instrText xml:space="preserve"> PAGEREF _Toc231104004 \h </w:instrText>
+            </w:r>
+            <w:r>
+              <w:rPr>
+                <w:noProof/>
+                <w:webHidden/>
+              </w:rPr>
+            </w:r>
+            <w:r>
+              <w:rPr>
+                <w:noProof/>
+                <w:webHidden/>
+              </w:rPr>
+              <w:fldChar w:fldCharType="separate"/>
+            </w:r>
+            <w:r>
+              <w:rPr>
+                <w:noProof/>
+                <w:webHidden/>
+              </w:rPr>
+              <w:t>4</w:t>
+            </w:r>
+            <w:r>
+              <w:rPr>
+                <w:noProof/>
+                <w:webHidden/>
+              </w:rPr>
+              <w:fldChar w:fldCharType="end"/>
+            </w:r>
+          </w:hyperlink>
+        </w:p>
+        <w:p>
+          <w:pPr>
+            <w:pStyle w:val="TOC2"/>
+            <w:tabs>
+              <w:tab w:val="left" w:pos="960"/>
+              <w:tab w:val="right" w:leader="dot" w:pos="9016"/>
+            </w:tabs>
+            <w:rPr>
+              <w:rFonts w:eastAsiaTheme="minorEastAsia"/>
+              <w:b w:val="0"/>
+              <w:bCs w:val="0"/>
+              <w:noProof/>
+              <w:sz w:val="24"/>
+              <w:szCs w:val="24"/>
+              <w:lang w:eastAsia="en-GB"/>
+            </w:rPr>
+          </w:pPr>
+          <w:hyperlink w:anchor="_Toc231104005" w:history="1">
+            <w:r>
+              <w:rPr>
+                <w:rStyle w:val="Hyperlink"/>
+                <w:noProof/>
+              </w:rPr>
+              <w:t>4.4</w:t>
+            </w:r>
+            <w:r>
+              <w:rPr>
+                <w:rFonts w:eastAsiaTheme="minorEastAsia"/>
+                <w:b w:val="0"/>
+                <w:bCs w:val="0"/>
+                <w:noProof/>
+                <w:sz w:val="24"/>
+                <w:szCs w:val="24"/>
+                <w:lang w:eastAsia="en-GB"/>
+              </w:rPr>
+              <w:tab/>
+            </w:r>
+            <w:r>
+              <w:rPr>
+                <w:rStyle w:val="Hyperlink"/>
+                <w:noProof/>
+              </w:rPr>
+              <w:t>Champion Model Selection and Feature Selection Finding</w:t>
+            </w:r>
+            <w:r>
+              <w:rPr>
+                <w:noProof/>
+                <w:webHidden/>
+              </w:rPr>
+              <w:tab/>
+            </w:r>
+            <w:r>
+              <w:rPr>
+                <w:noProof/>
+                <w:webHidden/>
+              </w:rPr>
+              <w:fldChar w:fldCharType="begin"/>
+            </w:r>
+            <w:r>
+              <w:rPr>
+                <w:noProof/>
+                <w:webHidden/>
+              </w:rPr>
+              <w:instrText xml:space="preserve"> PAGEREF _Toc231104005 \h </w:instrText>
+            </w:r>
+            <w:r>
+              <w:rPr>
+                <w:noProof/>
+                <w:webHidden/>
+              </w:rPr>
+            </w:r>
+            <w:r>
+              <w:rPr>
+                <w:noProof/>
+                <w:webHidden/>
+              </w:rPr>
+              <w:fldChar w:fldCharType="separate"/>
+            </w:r>
+            <w:r>
+              <w:rPr>
+                <w:noProof/>
+                <w:webHidden/>
+              </w:rPr>
+              <w:t>4</w:t>
+            </w:r>
+            <w:r>
+              <w:rPr>
+                <w:noProof/>
+                <w:webHidden/>
+              </w:rPr>
+              <w:fldChar w:fldCharType="end"/>
+            </w:r>
+          </w:hyperlink>
+        </w:p>
+        <w:p>
+          <w:pPr>
+            <w:pStyle w:val="TOC1"/>
+            <w:tabs>
+              <w:tab w:val="left" w:pos="480"/>
+              <w:tab w:val="right" w:leader="dot" w:pos="9016"/>
+            </w:tabs>
+            <w:rPr>
+              <w:rFonts w:eastAsiaTheme="minorEastAsia"/>
+              <w:b w:val="0"/>
+              <w:bCs w:val="0"/>
+              <w:i w:val="0"/>
+              <w:iCs w:val="0"/>
+              <w:noProof/>
+              <w:lang w:eastAsia="en-GB"/>
+            </w:rPr>
+          </w:pPr>
+          <w:hyperlink w:anchor="_Toc231104006" w:history="1">
+            <w:r>
+              <w:rPr>
+                <w:rStyle w:val="Hyperlink"/>
+                <w:noProof/>
+              </w:rPr>
+              <w:t>5</w:t>
+            </w:r>
+            <w:r>
+              <w:rPr>
+                <w:rFonts w:eastAsiaTheme="minorEastAsia"/>
+                <w:b w:val="0"/>
+                <w:bCs w:val="0"/>
+                <w:i w:val="0"/>
+                <w:iCs w:val="0"/>
+                <w:noProof/>
+                <w:lang w:eastAsia="en-GB"/>
+              </w:rPr>
+              <w:tab/>
+            </w:r>
+            <w:r>
+              <w:rPr>
+                <w:rStyle w:val="Hyperlink"/>
+                <w:noProof/>
+              </w:rPr>
+              <w:t>Evaluation</w:t>
+            </w:r>
+            <w:r>
+              <w:rPr>
+                <w:noProof/>
+                <w:webHidden/>
+              </w:rPr>
+              <w:tab/>
+            </w:r>
+            <w:r>
+              <w:rPr>
+                <w:noProof/>
+                <w:webHidden/>
+              </w:rPr>
+              <w:fldChar w:fldCharType="begin"/>
+            </w:r>
+            <w:r>
+              <w:rPr>
+                <w:noProof/>
+                <w:webHidden/>
+              </w:rPr>
+              <w:instrText xml:space="preserve"> PAGEREF _Toc231104006 \h </w:instrText>
+            </w:r>
+            <w:r>
+              <w:rPr>
+                <w:noProof/>
+                <w:webHidden/>
+              </w:rPr>
+            </w:r>
+            <w:r>
+              <w:rPr>
+                <w:noProof/>
+                <w:webHidden/>
+              </w:rPr>
+              <w:fldChar w:fldCharType="separate"/>
+            </w:r>
+            <w:r>
+              <w:rPr>
+                <w:noProof/>
+                <w:webHidden/>
+              </w:rPr>
+              <w:t>5</w:t>
+            </w:r>
+            <w:r>
+              <w:rPr>
+                <w:noProof/>
+                <w:webHidden/>
+              </w:rPr>
+              <w:fldChar w:fldCharType="end"/>
+            </w:r>
+          </w:hyperlink>
+        </w:p>
+        <w:p>
+          <w:pPr>
+            <w:pStyle w:val="TOC2"/>
+            <w:tabs>
+              <w:tab w:val="left" w:pos="960"/>
+              <w:tab w:val="right" w:leader="dot" w:pos="9016"/>
+            </w:tabs>
+            <w:rPr>
+              <w:rFonts w:eastAsiaTheme="minorEastAsia"/>
+              <w:b w:val="0"/>
+              <w:bCs w:val="0"/>
+              <w:noProof/>
+              <w:sz w:val="24"/>
+              <w:szCs w:val="24"/>
+              <w:lang w:eastAsia="en-GB"/>
+            </w:rPr>
+          </w:pPr>
+          <w:hyperlink w:anchor="_Toc231104007" w:history="1">
+            <w:r>
+              <w:rPr>
+                <w:rStyle w:val="Hyperlink"/>
+                <w:noProof/>
+              </w:rPr>
+              <w:t>5.1</w:t>
+            </w:r>
+            <w:r>
+              <w:rPr>
+                <w:rFonts w:eastAsiaTheme="minorEastAsia"/>
+                <w:b w:val="0"/>
+                <w:bCs w:val="0"/>
+                <w:noProof/>
+                <w:sz w:val="24"/>
+                <w:szCs w:val="24"/>
+                <w:lang w:eastAsia="en-GB"/>
+              </w:rPr>
+              <w:tab/>
+            </w:r>
+            <w:r>
+              <w:rPr>
+                <w:rStyle w:val="Hyperlink"/>
+                <w:noProof/>
+              </w:rPr>
+              <w:t>Champion Model Test Performance</w:t>
+            </w:r>
+            <w:r>
+              <w:rPr>
+                <w:noProof/>
+                <w:webHidden/>
+              </w:rPr>
+              <w:tab/>
+            </w:r>
+            <w:r>
+              <w:rPr>
+                <w:noProof/>
+                <w:webHidden/>
+              </w:rPr>
+              <w:fldChar w:fldCharType="begin"/>
+            </w:r>
+            <w:r>
+              <w:rPr>
+                <w:noProof/>
+                <w:webHidden/>
+              </w:rPr>
+              <w:instrText xml:space="preserve"> PAGEREF _Toc231104007 \h </w:instrText>
+            </w:r>
+            <w:r>
+              <w:rPr>
+                <w:noProof/>
+                <w:webHidden/>
+              </w:rPr>
+            </w:r>
+            <w:r>
+              <w:rPr>
+                <w:noProof/>
+                <w:webHidden/>
+              </w:rPr>
+              <w:fldChar w:fldCharType="separate"/>
+            </w:r>
+            <w:r>
+              <w:rPr>
+                <w:noProof/>
+                <w:webHidden/>
+              </w:rPr>
+              <w:t>5</w:t>
+            </w:r>
+            <w:r>
+              <w:rPr>
+                <w:noProof/>
+                <w:webHidden/>
+              </w:rPr>
+              <w:fldChar w:fldCharType="end"/>
+            </w:r>
+          </w:hyperlink>
+        </w:p>
+        <w:p>
+          <w:pPr>
+            <w:pStyle w:val="TOC1"/>
+            <w:tabs>
+              <w:tab w:val="left" w:pos="480"/>
+              <w:tab w:val="right" w:leader="dot" w:pos="9016"/>
+            </w:tabs>
+            <w:rPr>
+              <w:rFonts w:eastAsiaTheme="minorEastAsia"/>
+              <w:b w:val="0"/>
+              <w:bCs w:val="0"/>
+              <w:i w:val="0"/>
+              <w:iCs w:val="0"/>
+              <w:noProof/>
+              <w:lang w:eastAsia="en-GB"/>
+            </w:rPr>
+          </w:pPr>
+          <w:hyperlink w:anchor="_Toc231104008" w:history="1">
+            <w:r>
+              <w:rPr>
+                <w:rStyle w:val="Hyperlink"/>
+                <w:noProof/>
+              </w:rPr>
+              <w:t>6</w:t>
+            </w:r>
+            <w:r>
+              <w:rPr>
+                <w:rFonts w:eastAsiaTheme="minorEastAsia"/>
+                <w:b w:val="0"/>
+                <w:bCs w:val="0"/>
+                <w:i w:val="0"/>
+                <w:iCs w:val="0"/>
+                <w:noProof/>
+                <w:lang w:eastAsia="en-GB"/>
+              </w:rPr>
+              <w:tab/>
+            </w:r>
+            <w:r>
+              <w:rPr>
+                <w:rStyle w:val="Hyperlink"/>
+                <w:noProof/>
+              </w:rPr>
+              <w:t>Best Practices</w:t>
+            </w:r>
+            <w:r>
+              <w:rPr>
+                <w:noProof/>
+                <w:webHidden/>
+              </w:rPr>
+              <w:tab/>
+            </w:r>
+            <w:r>
+              <w:rPr>
+                <w:noProof/>
+                <w:webHidden/>
+              </w:rPr>
+              <w:fldChar w:fldCharType="begin"/>
+            </w:r>
+            <w:r>
+              <w:rPr>
+                <w:noProof/>
+                <w:webHidden/>
+              </w:rPr>
+              <w:instrText xml:space="preserve"> PAGEREF _Toc231104008 \h </w:instrText>
+            </w:r>
+            <w:r>
+              <w:rPr>
+                <w:noProof/>
+                <w:webHidden/>
+              </w:rPr>
+            </w:r>
+            <w:r>
+              <w:rPr>
+                <w:noProof/>
+                <w:webHidden/>
+              </w:rPr>
+              <w:fldChar w:fldCharType="separate"/>
+            </w:r>
+            <w:r>
+              <w:rPr>
+                <w:noProof/>
+                <w:webHidden/>
+              </w:rPr>
+              <w:t>5</w:t>
             </w:r>
             <w:r>
               <w:rPr>
@@ -1217,94 +2297,45 @@
         </w:p>
       </w:sdtContent>
     </w:sdt>
+    <w:p/>
     <w:p>
-      <w:pPr>
-        <w:rPr>
-          <w:rFonts w:ascii="Times New Roman" w:hAnsi="Times New Roman" w:cs="Times New Roman"/>
-        </w:rPr>
-      </w:pPr>
+      <w:r>
+        <w:br w:type="page"/>
+      </w:r>
     </w:p>
     <w:p>
       <w:pPr>
-        <w:rPr>
-          <w:rFonts w:ascii="Times New Roman" w:hAnsi="Times New Roman" w:cs="Times New Roman"/>
-        </w:rPr>
-      </w:pPr>
-      <w:r>
-        <w:rPr>
-          <w:rFonts w:ascii="Times New Roman" w:hAnsi="Times New Roman" w:cs="Times New Roman"/>
-        </w:rPr>
-        <w:br w:type="page"/>
+        <w:pStyle w:val="Heading1"/>
+      </w:pPr>
+      <w:bookmarkStart w:id="0" w:name="_Toc231103995"/>
+      <w:r>
+        <w:lastRenderedPageBreak/>
+        <w:t>Business Understanding</w:t>
+      </w:r>
+      <w:bookmarkEnd w:id="0"/>
+      <w:r>
+        <w:t xml:space="preserve">  </w:t>
       </w:r>
     </w:p>
     <w:p>
       <w:pPr>
-        <w:pStyle w:val="Heading1"/>
-        <w:rPr>
-          <w:rStyle w:val="Strong"/>
-          <w:b w:val="0"/>
-          <w:bCs w:val="0"/>
-        </w:rPr>
-      </w:pPr>
-      <w:bookmarkStart w:id="0" w:name="OLE_LINK1"/>
-      <w:bookmarkStart w:id="1" w:name="OLE_LINK2"/>
-      <w:bookmarkStart w:id="2" w:name="OLE_LINK3"/>
-      <w:bookmarkStart w:id="3" w:name="OLE_LINK4"/>
-      <w:bookmarkStart w:id="4" w:name="OLE_LINK5"/>
-      <w:bookmarkStart w:id="5" w:name="OLE_LINK6"/>
-      <w:r>
-        <w:rPr>
-          <w:rStyle w:val="Strong"/>
-          <w:b w:val="0"/>
-          <w:bCs w:val="0"/>
-        </w:rPr>
-        <w:lastRenderedPageBreak/>
-        <w:t>Business Understanding</w:t>
-      </w:r>
+        <w:pStyle w:val="Heading2"/>
+      </w:pPr>
+      <w:bookmarkStart w:id="1" w:name="_Toc231103996"/>
+      <w:r>
+        <w:t>The Business Problem</w:t>
+      </w:r>
+      <w:bookmarkEnd w:id="1"/>
     </w:p>
     <w:p>
-      <w:pPr>
-        <w:pStyle w:val="Heading2"/>
-      </w:pPr>
-      <w:r>
-        <w:t>The Business Problem</w:t>
-      </w:r>
-    </w:p>
-    <w:p>
-      <w:pPr>
-        <w:pStyle w:val="Heading2"/>
-        <w:numPr>
-          <w:ilvl w:val="0"/>
-          <w:numId w:val="0"/>
-        </w:numPr>
-        <w:ind w:left="576" w:hanging="576"/>
-      </w:pPr>
-      <w:r>
-        <w:rPr>
-          <w:rFonts w:asciiTheme="minorHAnsi" w:eastAsiaTheme="minorHAnsi" w:hAnsiTheme="minorHAnsi" w:cstheme="minorBidi"/>
-          <w:color w:val="auto"/>
-          <w:sz w:val="24"/>
-          <w:szCs w:val="24"/>
-        </w:rPr>
-        <w:t>Crédit Nationale Azur, a recently established French bank operating in Melbourne, is seeking to optimise its marketing strategy for personal loan products. During the previous financial year, the bank executed a broad promotional campaign offering competitive personal loan rates to its existing customer base. While the campaign successfully converted approximately 15% of the targeted customers, the blanket marketing approach of blindly contacting the entire customer base is highly inefficient. It incurs unnecessary operational and marketing costs while yielding a relatively low overall conversion rate. The primary business objective is to transition from this generalised approach to a highly targeted marketing strategy. By identifying and engaging only the customers who have a high propensity to accept a loan offer, the bank aims to significantly reduce customer acquisition costs while maintaining or increasing the total volume of successful loan originations.</w:t>
-      </w:r>
-    </w:p>
-    <w:p>
-      <w:pPr>
-        <w:pStyle w:val="Heading2"/>
-        <w:numPr>
-          <w:ilvl w:val="0"/>
-          <w:numId w:val="0"/>
-        </w:numPr>
-        <w:ind w:left="576" w:hanging="576"/>
-      </w:pPr>
-      <w:r>
-        <w:t>1.2 The Data Science Problem Definition</w:t>
-      </w:r>
-    </w:p>
-    <w:p>
-      <w:r>
-        <w:t>To achieve the business objective, this problem must be framed as a supervised machine learning task, specifically a binary classification problem. The bank possesses historical, labelled data from the previous year's campaign. The data science objective is to formulate a predictive model where the presence of the target condition (accepting the loan) is assigned to 1, and the absence of the condition (rejecting the loan) is assigned to 0. By training a classification algorithm to identify patterns between independent variables (such as income and education) and this binary target variable, the model will be able to evaluate current customers and output a probability score, classifying them as likely or unlikely to accept a future loan offer.</w:t>
+      <w:r>
+        <w:t xml:space="preserve">Crédit Nationale Azur, a recently established French bank operating in Melbourne, seeks to optimise its personal loan marketing strategy. During the previous financial year, a broad campaign converted approximately 15% of the entire customer base </w:t>
+      </w:r>
+      <w:r>
+        <w:t>,</w:t>
+      </w:r>
+      <w:r>
+        <w:t xml:space="preserve"> meaning 85% of marketing spend was wasted on uninterested customers. The primary business objective is to replace this blanket approach with a targeted strategy that identifies only high-propensity customers, significantly reducing acquisition costs while maintaining loan origination volume.</w:t>
       </w:r>
     </w:p>
     <w:p/>
@@ -1312,147 +2343,190 @@
       <w:pPr>
         <w:pStyle w:val="Heading2"/>
       </w:pPr>
-      <w:r>
-        <w:t>Project Plan and Methodology</w:t>
-      </w:r>
+      <w:bookmarkStart w:id="2" w:name="_Toc231103997"/>
+      <w:r>
+        <w:t>Data Science Problem Definition</w:t>
+      </w:r>
+      <w:bookmarkEnd w:id="2"/>
     </w:p>
     <w:p>
       <w:r>
-        <w:t>Initial Exploratory Data Analysis (EDA) will be conducted using visual and statistical summaries to identify data quality issues, such as missing values and outliers, and to formulate preliminary hypotheses regarding customer behaviour.</w:t>
-      </w:r>
-    </w:p>
-    <w:p>
-      <w:pPr>
-        <w:pStyle w:val="Heading3"/>
-      </w:pPr>
-      <w:r>
-        <w:t>Data Understanding</w:t>
-      </w:r>
-    </w:p>
-    <w:p>
-      <w:r>
-        <w:t xml:space="preserve">Initial </w:t>
-      </w:r>
-      <w:r>
-        <w:t>EDA</w:t>
-      </w:r>
-      <w:r>
-        <w:t xml:space="preserve"> will be conducted to identify data quality issues and formulate preliminary hypotheses regarding customer behavio</w:t>
-      </w:r>
-      <w:r>
-        <w:t>u</w:t>
-      </w:r>
-      <w:r>
-        <w:t>r.</w:t>
+        <w:t xml:space="preserve">This problem is framed as a supervised binary classification task. Historical labelled campaign data is used to train a predictive model, where loan acceptance = 1 and rejection = 0. By learning patterns between independent variables (income, education, credit behaviour) and the target, the model outputs a probability score per customer. Critically, a probability output </w:t>
+      </w:r>
+      <w:r>
+        <w:t>,</w:t>
+      </w:r>
+      <w:r>
+        <w:t xml:space="preserve"> rather than a rigid Yes/No </w:t>
+      </w:r>
+      <w:r>
+        <w:t>,</w:t>
+      </w:r>
+      <w:r>
+        <w:t xml:space="preserve"> allows the bank to adjust its targeting threshold dynamically based on quarterly marketing budgets: targeting only the highest-confidence customers when budgets are constrained, or widening the threshold to capture greater market share when budgets allow.</w:t>
       </w:r>
     </w:p>
     <w:p/>
     <w:p>
       <w:pPr>
-        <w:pStyle w:val="Heading3"/>
-      </w:pPr>
-      <w:r>
-        <w:t>Data Preparation</w:t>
-      </w:r>
+        <w:pStyle w:val="Heading2"/>
+      </w:pPr>
+      <w:bookmarkStart w:id="3" w:name="_Toc231103998"/>
+      <w:r>
+        <w:t>Methodology</w:t>
+      </w:r>
+      <w:bookmarkEnd w:id="3"/>
     </w:p>
     <w:p>
       <w:r>
-        <w:t>The raw dataset will undergo systematic cleaning. Crucially, missing values will be handled via median imputation, and extreme outliers will be addressed using the Interquartile Range (IQR) method to ensure mathematical stability for the algorithms. Categorical variables will also be one-hot encoded</w:t>
-      </w:r>
-      <w:r>
-        <w:t>.</w:t>
+        <w:t xml:space="preserve">This project follows the first five phases of CRISP-DM: Business Understanding, Data Understanding, Data Preparation, Modelling, and Evaluation. Two classification algorithms are developed and compared </w:t>
+      </w:r>
+      <w:r>
+        <w:t>,</w:t>
+      </w:r>
+      <w:r>
+        <w:t xml:space="preserve"> Random Forest and Support Vector Machine (SVM) </w:t>
+      </w:r>
+      <w:r>
+        <w:t>,</w:t>
+      </w:r>
+      <w:r>
+        <w:t xml:space="preserve"> across two modelling tracks (feature selection vs. all features), with hyperparameter tuning applied to all configurations.</w:t>
       </w:r>
     </w:p>
     <w:p/>
     <w:p>
       <w:pPr>
-        <w:pStyle w:val="Heading3"/>
-      </w:pPr>
-      <w:r>
-        <w:lastRenderedPageBreak/>
-        <w:t xml:space="preserve">Modelling </w:t>
-      </w:r>
+        <w:pStyle w:val="Heading1"/>
+      </w:pPr>
+      <w:bookmarkStart w:id="4" w:name="_Toc231103999"/>
+      <w:r>
+        <w:t>Data Understanding</w:t>
+      </w:r>
+      <w:bookmarkEnd w:id="4"/>
     </w:p>
     <w:p>
       <w:r>
-        <w:t xml:space="preserve">Multiple robust classification algorithms (excluding basic Logistic Regression and Naive Bayes) will be developed. The models will be subjected to hyperparameter tuning and feature selection (using </w:t>
+        <w:t xml:space="preserve">Initial inspection of the dataset (6,000 rows, 13 columns) was conducted using </w:t>
       </w:r>
       <w:proofErr w:type="spellStart"/>
       <w:r>
-        <w:t>SelectKBest</w:t>
+        <w:t>df.shape</w:t>
       </w:r>
       <w:proofErr w:type="spellEnd"/>
       <w:r>
-        <w:t>) to maximise predictive accuracy</w:t>
-      </w:r>
-      <w:r>
-        <w:t>.</w:t>
+        <w:t xml:space="preserve"> and a transposed </w:t>
+      </w:r>
+      <w:proofErr w:type="spellStart"/>
+      <w:r>
+        <w:t>df.describe</w:t>
+      </w:r>
+      <w:proofErr w:type="spellEnd"/>
+      <w:r>
+        <w:t>().T to improve readability of continuous variable distributions. This revealed four features with missing values: Age, Years of Experience, Family Size, and Income. Because these variables are central to financial profiling, deletion was rejected in favour of imputation, which is addressed in the preparation phase.</w:t>
       </w:r>
     </w:p>
     <w:p/>
     <w:p>
-      <w:pPr>
-        <w:pStyle w:val="Heading3"/>
-      </w:pPr>
-      <w:r>
-        <w:t>Evaluation</w:t>
-      </w:r>
-    </w:p>
-    <w:p>
-      <w:r>
-        <w:t>The final models will be evaluated against appropriate technical metrics. Due to the imbalanced nature of the dataset, accuracy will be discarded in favour of Precision, Recall, and the F1-Score to ensure the solution effectively minimises false positives while capturing true prospects</w:t>
-      </w:r>
-      <w:r>
-        <w:t>.</w:t>
-      </w:r>
-    </w:p>
-    <w:bookmarkEnd w:id="0"/>
-    <w:bookmarkEnd w:id="1"/>
-    <w:p/>
-    <w:p>
-      <w:pPr>
-        <w:pStyle w:val="Heading1"/>
-      </w:pPr>
-      <w:r>
-        <w:t>Data Understanding</w:t>
-      </w:r>
-    </w:p>
-    <w:p>
-      <w:r>
-        <w:t>Initial data inspection was conducted using Python Pandas to assess the dataset's structure, which consists of 6000 rows and 13 columns (</w:t>
-      </w:r>
-      <w:proofErr w:type="spellStart"/>
-      <w:r>
-        <w:t>df.shape</w:t>
-      </w:r>
-      <w:proofErr w:type="spellEnd"/>
-      <w:r>
-        <w:t>). A transposed statistical summary (</w:t>
-      </w:r>
-      <w:proofErr w:type="spellStart"/>
-      <w:r>
-        <w:t>df.describe</w:t>
-      </w:r>
-      <w:proofErr w:type="spellEnd"/>
-      <w:r>
-        <w:t>().T) was generated to improve the readability of continuous variable distributions. This inspection revealed significant data quality issues. Four critical features contain missing values: Age, Years of Experience, Family Size, and Income. Because these variables are fundamentally linked to financial profiling, they will require systematic median imputation during the preparation phase rather than deletion, ensuring the dataset remains robust.</w:t>
+      <w:r>
+        <w:t xml:space="preserve">EDA was performed to surface patterns visually and statistically. A univariate pie chart confirmed severe class imbalance: approximately 85% loan rejections vs. 15% acceptances. This finding drove the decision to use F1-Score </w:t>
+      </w:r>
+      <w:r>
+        <w:t>,</w:t>
+      </w:r>
+      <w:r>
+        <w:t xml:space="preserve"> not accuracy </w:t>
+      </w:r>
+      <w:r>
+        <w:t>,</w:t>
+      </w:r>
+      <w:r>
+        <w:t xml:space="preserve"> as the primary evaluation metric throughout. Bivariate boxplots across continuous variables against the target generated two key hypotheses. First, customers who accepted loans showed a significantly higher median income, with high-value outliers concentrated in </w:t>
+      </w:r>
+      <w:r>
+        <w:lastRenderedPageBreak/>
+        <w:t xml:space="preserve">the rejected class </w:t>
+      </w:r>
+      <w:r>
+        <w:t>,</w:t>
+      </w:r>
+      <w:r>
+        <w:t xml:space="preserve"> suggesting income is predictive but requires outlier treatment to avoid distorting distance-based models. Second, credit card spend was notably higher among acceptors, indicating that existing credit-active customers are more receptive to secondary financial products. Both hypotheses directly motivated the data preparation decisions described below.</w:t>
       </w:r>
     </w:p>
     <w:p/>
     <w:p>
-      <w:r>
-        <w:t>EDA</w:t>
-      </w:r>
-      <w:r>
-        <w:t xml:space="preserve"> was subsequently performed to discover patterns visually and statistically. A univariate pie chart confirmed the heavily imbalanced nature of the dataset, with the majority class (loan rejection) dominating. To isolate variables impacting loan acceptance, bivariate analysis was visualised using subplot grids. Box plots were specifically deployed for outlier detection across continuous variables. The visualisations generated two primary hypotheses. Firstly, the income distribution box plot revealed a significantly higher median income among customers who accepted the loan, alongside a concentration of high-value outliers in the rejected class. Secondly, credit card </w:t>
+      <w:pPr>
+        <w:pStyle w:val="Heading1"/>
+      </w:pPr>
+      <w:bookmarkStart w:id="5" w:name="_Toc231104000"/>
+      <w:r>
+        <w:t>Data Preparation</w:t>
+      </w:r>
+      <w:bookmarkEnd w:id="5"/>
+    </w:p>
+    <w:p>
+      <w:r>
+        <w:t>The raw dataset was cleaned systematically to ensure mathematical stability for both tree-based and distance-based algorithms.</w:t>
+      </w:r>
+    </w:p>
+    <w:p>
+      <w:r>
+        <w:t xml:space="preserve">Duplicate records were </w:t>
       </w:r>
       <w:proofErr w:type="gramStart"/>
       <w:r>
-        <w:t>spend</w:t>
+        <w:t>dropped</w:t>
       </w:r>
       <w:proofErr w:type="gramEnd"/>
       <w:r>
-        <w:t xml:space="preserve"> plots indicated that active credit users are more receptive to secondary financial products. These insights justify the need for rigorous outlier handling in the subsequent data preparation phase to prevent mathematical distortion in the classification models.</w:t>
+        <w:t xml:space="preserve"> and the index reset. Missing values in Age, Years of Experience, Family Size, and Income were imputed using each column's median rather than the mean. Median was specifically chosen because the income and mortgage distributions are right-skewed; mean imputation would artificially inflate these values and bias the feature distributions used in model training.</w:t>
+      </w:r>
+    </w:p>
+    <w:p>
+      <w:r>
+        <w:t>Continuous variables were treated for outliers using the IQR method. Values outside 1.5 × IQR bounds were replaced with the column median. Capping was chosen over deletion to preserve dataset size, and over boundary-value replacement to avoid introducing new extreme values at the IQR fence. This step is critical for the SVM algorithm, which computes spatial decision boundaries and is disproportionately distorted by outliers in high-magnitude features like Income and Mortgage Amount.</w:t>
+      </w:r>
+    </w:p>
+    <w:p>
+      <w:r>
+        <w:t xml:space="preserve">To strictly prevent data leakage, all remaining transformations </w:t>
+      </w:r>
+      <w:r>
+        <w:t>,</w:t>
+      </w:r>
+      <w:r>
+        <w:t xml:space="preserve"> one-hot encoding of categorical variables, </w:t>
+      </w:r>
+      <w:proofErr w:type="spellStart"/>
+      <w:r>
+        <w:t>StandardScaler</w:t>
+      </w:r>
+      <w:proofErr w:type="spellEnd"/>
+      <w:r>
+        <w:t xml:space="preserve"> standardisation, and </w:t>
+      </w:r>
+      <w:proofErr w:type="spellStart"/>
+      <w:r>
+        <w:t>SelectKBest</w:t>
+      </w:r>
+      <w:proofErr w:type="spellEnd"/>
+      <w:r>
+        <w:t xml:space="preserve"> feature selection </w:t>
+      </w:r>
+      <w:r>
+        <w:t>,</w:t>
+      </w:r>
+      <w:r>
+        <w:t xml:space="preserve"> were deliberately deferred until after the train/test split in the modelling phase. The cleaned dataset was exported as </w:t>
+      </w:r>
+      <w:proofErr w:type="spellStart"/>
+      <w:r>
+        <w:t>cleaned_data.pkl</w:t>
+      </w:r>
+      <w:proofErr w:type="spellEnd"/>
+      <w:r>
+        <w:t xml:space="preserve"> to guarantee a static, unaltered input baseline for all subsequent modelling notebooks.</w:t>
       </w:r>
     </w:p>
     <w:p/>
@@ -1460,132 +2534,507 @@
       <w:pPr>
         <w:pStyle w:val="Heading1"/>
       </w:pPr>
-      <w:r>
-        <w:t>Data Preparation</w:t>
-      </w:r>
+      <w:bookmarkStart w:id="6" w:name="_Toc231104001"/>
+      <w:r>
+        <w:t>Modelling</w:t>
+      </w:r>
+      <w:bookmarkEnd w:id="6"/>
     </w:p>
     <w:p>
-      <w:r>
-        <w:t>To ensure mathematical stability for the predictive models, the raw dataset underwent rigorous preparation. Initially, duplicate records were dropped, and the index was reset to maintain structural integrity.</w:t>
+      <w:pPr>
+        <w:pStyle w:val="Heading2"/>
+      </w:pPr>
+      <w:bookmarkStart w:id="7" w:name="_Toc231104002"/>
+      <w:r>
+        <w:t>Data Pipeline and Train/Test Split</w:t>
+      </w:r>
+      <w:bookmarkEnd w:id="7"/>
+    </w:p>
+    <w:p>
+      <w:r>
+        <w:t>The cleaned dataset was split 80/20 into training and testing sets with stratify=y applied to preserve the 85/15 class ratio in both sets, preventing algorithm bias from the imbalanced classes. All post-split transformations followed a strict pipeline chronology to prevent data leakage:</w:t>
       </w:r>
     </w:p>
     <w:p/>
     <w:p>
-      <w:r>
-        <w:t xml:space="preserve">Addressing the missing values identified during the Exploratory Data Analysis (Age, Years of Experience, Family Size, and Income) required a deliberate approach. Rather </w:t>
-      </w:r>
-      <w:r>
-        <w:lastRenderedPageBreak/>
-        <w:t>than deleting these records and losing valuable information, the missing values were imputed using the median of their respective columns. This method was specifically chosen over mean imputation to avoid skewing the data via extreme values.</w:t>
+      <w:pPr>
+        <w:pStyle w:val="ListParagraph"/>
+        <w:numPr>
+          <w:ilvl w:val="0"/>
+          <w:numId w:val="18"/>
+        </w:numPr>
+      </w:pPr>
+      <w:r>
+        <w:t>One-hot encoding (categorical → binary integers)</w:t>
+      </w:r>
+    </w:p>
+    <w:p>
+      <w:pPr>
+        <w:pStyle w:val="ListParagraph"/>
+        <w:numPr>
+          <w:ilvl w:val="0"/>
+          <w:numId w:val="18"/>
+        </w:numPr>
+      </w:pPr>
+      <w:proofErr w:type="spellStart"/>
+      <w:r>
+        <w:t>SelectKBest</w:t>
+      </w:r>
+      <w:proofErr w:type="spellEnd"/>
+      <w:r>
+        <w:t xml:space="preserve">(chi2, k=7) </w:t>
+      </w:r>
+      <w:r>
+        <w:t>,</w:t>
+      </w:r>
+      <w:r>
+        <w:t xml:space="preserve"> applied to </w:t>
+      </w:r>
+      <w:proofErr w:type="gramStart"/>
+      <w:r>
+        <w:t>selected-features</w:t>
+      </w:r>
+      <w:proofErr w:type="gramEnd"/>
+      <w:r>
+        <w:t xml:space="preserve"> track only</w:t>
+      </w:r>
+    </w:p>
+    <w:p>
+      <w:pPr>
+        <w:pStyle w:val="ListParagraph"/>
+        <w:numPr>
+          <w:ilvl w:val="0"/>
+          <w:numId w:val="18"/>
+        </w:numPr>
+      </w:pPr>
+      <w:proofErr w:type="spellStart"/>
+      <w:r>
+        <w:t>StandardScaler</w:t>
+      </w:r>
+      <w:proofErr w:type="spellEnd"/>
+      <w:r>
+        <w:t xml:space="preserve"> </w:t>
+      </w:r>
+      <w:r>
+        <w:t>,</w:t>
+      </w:r>
+      <w:r>
+        <w:t xml:space="preserve"> fit on training data only, applied to both sets</w:t>
       </w:r>
     </w:p>
     <w:p/>
     <w:p>
       <w:r>
-        <w:t>Furthermore, continuous numerical variables were treated for outliers using the IQR method. Values falling outside the 1.5 IQR bounds were replaced with the column median via a programmatic loop. Capping these outliers is a critical necessity because algorithms calculating distance or decision boundaries can be disproportionately distorted by extreme anomalies.</w:t>
+        <w:t>The order of steps 2 and 3 is intentional: standardisation introduces negative values, which would invalidate the chi-squared test if applied first.</w:t>
       </w:r>
     </w:p>
     <w:p/>
     <w:p>
-      <w:r>
-        <w:t>Finally, to strictly adhere to the principle of preventing data leakage, complex transformations such as standardisation and categorical encoding were purposely deferred. As per best practices, categorical variables will be one-hot encoded using Pandas (</w:t>
-      </w:r>
-      <w:proofErr w:type="spellStart"/>
-      <w:r>
-        <w:t>pd.get_dummies</w:t>
-      </w:r>
-      <w:proofErr w:type="spellEnd"/>
-      <w:r>
-        <w:t xml:space="preserve">()), and continuous features will be scaled using </w:t>
-      </w:r>
-      <w:proofErr w:type="spellStart"/>
-      <w:r>
-        <w:t>StandardScaler</w:t>
-      </w:r>
-      <w:proofErr w:type="spellEnd"/>
-      <w:r>
-        <w:t xml:space="preserve"> only after the dataset is split into training and testing sets during the modelling phase. The cleaned baseline data was pickled and exported to guarantee a static, unaltered dataset for all subsequent models.</w:t>
+      <w:pPr>
+        <w:pStyle w:val="Heading2"/>
+      </w:pPr>
+      <w:bookmarkStart w:id="8" w:name="_Toc231104003"/>
+      <w:r>
+        <w:lastRenderedPageBreak/>
+        <w:t>Baseline Models</w:t>
+      </w:r>
+      <w:bookmarkEnd w:id="8"/>
+    </w:p>
+    <w:p>
+      <w:r>
+        <w:t xml:space="preserve">Two algorithms were evaluated as baselines across two tracks </w:t>
+      </w:r>
+      <w:r>
+        <w:t>,</w:t>
+      </w:r>
+      <w:r>
+        <w:t xml:space="preserve"> selected features (k=7) and all features (n=23):</w:t>
       </w:r>
     </w:p>
     <w:p/>
     <w:p>
-      <w:pPr>
-        <w:pStyle w:val="Heading1"/>
-      </w:pPr>
-      <w:r>
-        <w:t>Modelling</w:t>
-      </w:r>
-    </w:p>
-    <w:p>
-      <w:pPr>
-        <w:pStyle w:val="Heading2"/>
-      </w:pPr>
-      <w:r>
-        <w:t xml:space="preserve">Baseline Model 1: </w:t>
-      </w:r>
-      <w:r>
-        <w:t>Random</w:t>
-      </w:r>
-      <w:r>
-        <w:t xml:space="preserve"> Forest and Pipeline Chronology</w:t>
-      </w:r>
-    </w:p>
-    <w:p>
-      <w:r>
-        <w:t>To establish a predictive baseline, a Random Forest classifier was developed as the primary model. Prior to training, the prepared dataset was split into an 80/20 training and testing configuration. Crucially, stratification was applied to the target variable to ensure the severe class imbalance (approximately 85% rejected, 15% accepted) was proportionally maintained across both sets, preventing algorithm bias.</w:t>
+      <w:r>
+        <w:t>The Random Forest (selected features) baseline achieved F1=0.7024, Recall=0.7278, Precision=0.6788, demonstrating strong recall (capturing more true acceptors) at a moderate precision cost.</w:t>
       </w:r>
     </w:p>
     <w:p/>
     <w:p>
       <w:r>
-        <w:t>To strictly prevent data leakage, all advanced feature engineering was performed exclusively after the train/test split. A rigorous, chronological transformation pipeline was established:</w:t>
+        <w:t xml:space="preserve">The SVM (all features) baseline achieved F1=0.7375, with notably high Precision of 0.7862 </w:t>
+      </w:r>
+      <w:r>
+        <w:t>,</w:t>
+      </w:r>
+      <w:r>
+        <w:t xml:space="preserve"> only 34 false positives </w:t>
+      </w:r>
+      <w:r>
+        <w:t>,</w:t>
+      </w:r>
+      <w:r>
+        <w:t xml:space="preserve"> making it the most conservative baseline and the optimal choice for minimising wasted marketing spend. However, this precision advantage came at the cost of lower recall, meaning more genuine acceptors were missed.</w:t>
       </w:r>
     </w:p>
     <w:p/>
     <w:p>
+      <w:r>
+        <w:t xml:space="preserve">The SVM (selected features) baseline failed catastrophically, achieving F1=0.0825. The root cause is that </w:t>
+      </w:r>
+      <w:proofErr w:type="spellStart"/>
+      <w:r>
+        <w:t>SelectKBest</w:t>
+      </w:r>
+      <w:proofErr w:type="spellEnd"/>
+      <w:r>
+        <w:t>(chi2, k=7) eliminated the feature variance required for SVM's distance-based boundary calculation. Chi-squared prioritises univariate predictive power, not the multivariate spatial separation that SVM requires. This configuration was excluded from tuning.</w:t>
+      </w:r>
+    </w:p>
+    <w:p/>
+    <w:p>
+      <w:pPr>
+        <w:pStyle w:val="Heading2"/>
+      </w:pPr>
+      <w:bookmarkStart w:id="9" w:name="_Toc231104004"/>
+      <w:r>
+        <w:t>Hyperparameter Tuning</w:t>
+      </w:r>
+      <w:bookmarkEnd w:id="9"/>
+    </w:p>
+    <w:p>
+      <w:proofErr w:type="spellStart"/>
+      <w:r>
+        <w:t>GridSearchCV</w:t>
+      </w:r>
+      <w:proofErr w:type="spellEnd"/>
+      <w:r>
+        <w:t xml:space="preserve"> with 5-fold stratified cross-validation was applied to all remaining configurations, scoring against F1 to optimise for the imbalanced class problem. Results:</w:t>
+      </w:r>
+    </w:p>
+    <w:p>
+      <w:proofErr w:type="spellStart"/>
+      <w:r>
+        <w:t>ConfigurationBest</w:t>
+      </w:r>
+      <w:proofErr w:type="spellEnd"/>
+      <w:r>
+        <w:t xml:space="preserve"> </w:t>
+      </w:r>
+      <w:proofErr w:type="spellStart"/>
+      <w:r>
+        <w:t>ParametersCV</w:t>
+      </w:r>
+      <w:proofErr w:type="spellEnd"/>
+      <w:r>
+        <w:t xml:space="preserve"> F1RF </w:t>
+      </w:r>
+      <w:r>
+        <w:t>,</w:t>
+      </w:r>
+      <w:r>
+        <w:t xml:space="preserve"> All </w:t>
+      </w:r>
+      <w:proofErr w:type="spellStart"/>
+      <w:r>
+        <w:t>Featuresn_estimators</w:t>
+      </w:r>
+      <w:proofErr w:type="spellEnd"/>
+      <w:r>
+        <w:t xml:space="preserve">=50, </w:t>
+      </w:r>
+      <w:proofErr w:type="spellStart"/>
+      <w:r>
+        <w:t>max_depth</w:t>
+      </w:r>
+      <w:proofErr w:type="spellEnd"/>
+      <w:r>
+        <w:t xml:space="preserve">=10, gini0.7245RF </w:t>
+      </w:r>
+      <w:r>
+        <w:t>,</w:t>
+      </w:r>
+      <w:r>
+        <w:t xml:space="preserve"> Selected (k=7)</w:t>
+      </w:r>
+      <w:proofErr w:type="spellStart"/>
+      <w:r>
+        <w:t>n_estimators</w:t>
+      </w:r>
+      <w:proofErr w:type="spellEnd"/>
+      <w:r>
+        <w:t xml:space="preserve">=200, </w:t>
+      </w:r>
+      <w:proofErr w:type="spellStart"/>
+      <w:r>
+        <w:t>max_depth</w:t>
+      </w:r>
+      <w:proofErr w:type="spellEnd"/>
+      <w:r>
+        <w:t xml:space="preserve">=10, entropy0.7129SVM </w:t>
+      </w:r>
+      <w:r>
+        <w:t>,</w:t>
+      </w:r>
+      <w:r>
+        <w:t xml:space="preserve"> All </w:t>
+      </w:r>
+      <w:proofErr w:type="spellStart"/>
+      <w:r>
+        <w:t>FeaturesC</w:t>
+      </w:r>
+      <w:proofErr w:type="spellEnd"/>
+      <w:r>
+        <w:t xml:space="preserve">=1.5, kernel=linear0.7125SVM </w:t>
+      </w:r>
+      <w:r>
+        <w:t>,</w:t>
+      </w:r>
+      <w:r>
+        <w:t xml:space="preserve"> Selected (k=7)C=1.0, kernel=linear0.6904</w:t>
+      </w:r>
+    </w:p>
+    <w:p/>
+    <w:p>
+      <w:pPr>
+        <w:pStyle w:val="Heading2"/>
+      </w:pPr>
+      <w:bookmarkStart w:id="10" w:name="_Toc231104005"/>
+      <w:r>
+        <w:t>Champion Model Selection and Feature Selection Finding</w:t>
+      </w:r>
+      <w:bookmarkEnd w:id="10"/>
+    </w:p>
+    <w:p>
+      <w:r>
+        <w:t xml:space="preserve">An unexpected finding emerged: </w:t>
+      </w:r>
+      <w:proofErr w:type="spellStart"/>
+      <w:r>
+        <w:t>SelectKBest</w:t>
+      </w:r>
+      <w:proofErr w:type="spellEnd"/>
+      <w:r>
+        <w:t>(chi2, k=7) reduced performance across both algorithms rather than improving generalisation. The Random Forest with all 23 features achieved the highest CV F1 of 0.7245, outperforming the k=7 RF track by 0.0116. This outcome is explained by the nature of tree-based ensembles: Random Forest leverages multivariate feature interactions across splits, whereas chi-squared selects on univariate signal only. Forcing k=7 created a bottleneck that eliminated features with subtle but cumulative predictive value. The empirical evidence validates retaining all features without selection.</w:t>
+      </w:r>
+    </w:p>
+    <w:p/>
+    <w:p>
+      <w:r>
+        <w:t xml:space="preserve">The champion model is therefore: </w:t>
+      </w:r>
+      <w:proofErr w:type="spellStart"/>
+      <w:r>
+        <w:t>RandomForestClassifier</w:t>
+      </w:r>
+      <w:proofErr w:type="spellEnd"/>
+      <w:r>
+        <w:t>(</w:t>
+      </w:r>
+      <w:proofErr w:type="spellStart"/>
+      <w:r>
+        <w:t>n_estimators</w:t>
+      </w:r>
+      <w:proofErr w:type="spellEnd"/>
+      <w:r>
+        <w:t xml:space="preserve">=50, </w:t>
+      </w:r>
+      <w:proofErr w:type="spellStart"/>
+      <w:r>
+        <w:t>max_depth</w:t>
+      </w:r>
+      <w:proofErr w:type="spellEnd"/>
+      <w:r>
+        <w:t>=10, criterion='</w:t>
+      </w:r>
+      <w:proofErr w:type="spellStart"/>
+      <w:r>
+        <w:t>gini</w:t>
+      </w:r>
+      <w:proofErr w:type="spellEnd"/>
+      <w:r>
+        <w:t xml:space="preserve">') trained on all 23 encoded features. The parameter choices are justified as follows: </w:t>
+      </w:r>
+      <w:proofErr w:type="spellStart"/>
+      <w:r>
+        <w:t>n_estimators</w:t>
+      </w:r>
+      <w:proofErr w:type="spellEnd"/>
+      <w:r>
+        <w:t xml:space="preserve">=50 outperformed 100 and 200 (excess trees introduced averaging noise); </w:t>
+      </w:r>
+      <w:proofErr w:type="spellStart"/>
+      <w:r>
+        <w:t>max_depth</w:t>
+      </w:r>
+      <w:proofErr w:type="spellEnd"/>
+      <w:r>
+        <w:t xml:space="preserve">=10 constrains tree complexity to prevent overfitting while preserving sufficient decision boundary resolution; </w:t>
+      </w:r>
+      <w:proofErr w:type="spellStart"/>
+      <w:r>
+        <w:t>gini</w:t>
+      </w:r>
+      <w:proofErr w:type="spellEnd"/>
+      <w:r>
+        <w:t xml:space="preserve"> outperformed entropy in cross-validation for this dataset.</w:t>
+      </w:r>
+    </w:p>
+    <w:p/>
+    <w:p>
+      <w:pPr>
+        <w:pStyle w:val="Heading1"/>
+      </w:pPr>
+      <w:bookmarkStart w:id="11" w:name="_Toc231104006"/>
+      <w:r>
+        <w:t>Evaluation</w:t>
+      </w:r>
+      <w:bookmarkEnd w:id="11"/>
+    </w:p>
+    <w:p>
+      <w:pPr>
+        <w:pStyle w:val="Heading2"/>
+      </w:pPr>
+      <w:bookmarkStart w:id="12" w:name="_Toc231104007"/>
+      <w:r>
+        <w:t>Champion Model Test Performance</w:t>
+      </w:r>
+      <w:bookmarkEnd w:id="12"/>
+    </w:p>
+    <w:p>
+      <w:r>
+        <w:t xml:space="preserve">Predicted </w:t>
+      </w:r>
+      <w:proofErr w:type="spellStart"/>
+      <w:r>
+        <w:t>NegativePredicted</w:t>
+      </w:r>
+      <w:proofErr w:type="spellEnd"/>
+      <w:r>
+        <w:t xml:space="preserve"> </w:t>
+      </w:r>
+      <w:proofErr w:type="spellStart"/>
+      <w:r>
+        <w:t>PositiveActual</w:t>
+      </w:r>
+      <w:proofErr w:type="spellEnd"/>
+      <w:r>
+        <w:t xml:space="preserve"> Negative977 (TN)43 (FP)Actual Positive60 (FN)120 (TP)</w:t>
+      </w:r>
+    </w:p>
+    <w:p/>
+    <w:p>
       <w:pPr>
         <w:pStyle w:val="ListParagraph"/>
         <w:numPr>
           <w:ilvl w:val="0"/>
-          <w:numId w:val="8"/>
+          <w:numId w:val="19"/>
         </w:numPr>
       </w:pPr>
       <w:r>
-        <w:t>Encoding: Categorical text variables were one-hot encoded into binary integers to ensure mathematical compatibility with subsequent algorithms.</w:t>
+        <w:t>F1-Score: 0.6997</w:t>
+      </w:r>
+    </w:p>
+    <w:p>
+      <w:pPr>
+        <w:pStyle w:val="ListParagraph"/>
+        <w:numPr>
+          <w:ilvl w:val="0"/>
+          <w:numId w:val="19"/>
+        </w:numPr>
+      </w:pPr>
+      <w:r>
+        <w:t xml:space="preserve">Precision: 0.7362 </w:t>
+      </w:r>
+      <w:r>
+        <w:t>,</w:t>
+      </w:r>
+      <w:r>
+        <w:t xml:space="preserve"> 73.6% of predicted acceptors are genuine</w:t>
+      </w:r>
+    </w:p>
+    <w:p>
+      <w:pPr>
+        <w:pStyle w:val="ListParagraph"/>
+        <w:numPr>
+          <w:ilvl w:val="0"/>
+          <w:numId w:val="19"/>
+        </w:numPr>
+      </w:pPr>
+      <w:r>
+        <w:t xml:space="preserve">Recall: 0.6667 </w:t>
+      </w:r>
+      <w:r>
+        <w:t>,</w:t>
+      </w:r>
+      <w:r>
+        <w:t xml:space="preserve"> model captures 2 in 3 true acceptors</w:t>
+      </w:r>
+    </w:p>
+    <w:p>
+      <w:pPr>
+        <w:pStyle w:val="ListParagraph"/>
+        <w:numPr>
+          <w:ilvl w:val="0"/>
+          <w:numId w:val="19"/>
+        </w:numPr>
+      </w:pPr>
+      <w:r>
+        <w:t xml:space="preserve">Specificity: 0.9578 </w:t>
+      </w:r>
+      <w:r>
+        <w:t>,</w:t>
+      </w:r>
+      <w:r>
+        <w:t xml:space="preserve"> 95.8% of non-acceptors correctly excluded</w:t>
       </w:r>
     </w:p>
     <w:p/>
     <w:p>
-      <w:pPr>
-        <w:pStyle w:val="ListParagraph"/>
-        <w:numPr>
-          <w:ilvl w:val="0"/>
-          <w:numId w:val="8"/>
-        </w:numPr>
-      </w:pPr>
-      <w:r>
-        <w:t xml:space="preserve">Feature Selection: With a fully numerical dataset, feature selection was executed using the </w:t>
-      </w:r>
-      <w:proofErr w:type="spellStart"/>
-      <w:r>
-        <w:t>SelectKBest</w:t>
-      </w:r>
-      <w:proofErr w:type="spellEnd"/>
-      <w:r>
-        <w:t xml:space="preserve"> algorithm with a Chi-Squared (chi2) scoring function, successfully isolating the top seven most statistically significant predictors.</w:t>
+      <w:r>
+        <w:t>The cross-validated F1 of 0.7245 vs. the test F1 of 0.6997 represents a 3.4% variance, which is acceptable for a production model and does not indicate overfitting. The modest test-set gap is attributable to the inherent variance between the specific 20% held-out sample and the five cross-validation folds; the CV-tuned parameters are expected to reproduce this performance range on new customer data, whereas a model optimised purely on training data risks more severe collapse on unseen records.</w:t>
+      </w:r>
+    </w:p>
+    <w:p>
+      <w:r>
+        <w:t>Business Impact: The untargeted campaign wasted marketing spend on 85% of contacts (rejectors). This model wastes spend on only 5.8% of contacts (43 FP out of 737), a 79.2% improvement in marketing efficiency. Each false positive represents approximately €25 in wasted outreach cost. The 60 false negatives represent missed revenue opportunities, but expanding the target list to recover them would sharply increase false positives and erode campaign ROI.</w:t>
       </w:r>
     </w:p>
     <w:p/>
     <w:p>
       <w:pPr>
-        <w:pStyle w:val="ListParagraph"/>
-        <w:numPr>
-          <w:ilvl w:val="0"/>
-          <w:numId w:val="8"/>
-        </w:numPr>
-      </w:pPr>
-      <w:r>
-        <w:t xml:space="preserve">Standardisation: Following feature selection, the remaining continuous variables were scaled using </w:t>
+        <w:pStyle w:val="Heading1"/>
+      </w:pPr>
+      <w:bookmarkStart w:id="13" w:name="_Toc231104008"/>
+      <w:r>
+        <w:t>Best Practices</w:t>
+      </w:r>
+      <w:bookmarkEnd w:id="13"/>
+    </w:p>
+    <w:p>
+      <w:r>
+        <w:t xml:space="preserve">Best Practice 1 </w:t>
+      </w:r>
+      <w:r>
+        <w:t>-</w:t>
+      </w:r>
+      <w:r>
+        <w:t xml:space="preserve"> Strict Prevention of Data Leakage</w:t>
+      </w:r>
+    </w:p>
+    <w:p>
+      <w:r>
+        <w:t>Data leakage</w:t>
+      </w:r>
+      <w:r>
+        <w:t>,</w:t>
+      </w:r>
+      <w:r>
+        <w:t xml:space="preserve"> where test-set information contaminates model training</w:t>
+      </w:r>
+      <w:r>
+        <w:t>,</w:t>
+      </w:r>
+      <w:r>
+        <w:t xml:space="preserve"> produces inflated metrics that collapse in deployment. This was prevented by enforcing a chronological pipeline: the train/test split was performed first, and all transformations (encoding, scaling, feature selection) were applied afterwards, with the </w:t>
       </w:r>
       <w:proofErr w:type="spellStart"/>
       <w:r>
@@ -1593,237 +3042,154 @@
       </w:r>
       <w:proofErr w:type="spellEnd"/>
       <w:r>
-        <w:t>. This sequence was intentionally chosen because standardisation introduces negative values, which would otherwise invalidate the chi2 mathematical test if performed out of order.</w:t>
+        <w:t xml:space="preserve"> fitted exclusively on training data and applied to the test set. This ensures the model operated completely blind to test-set distributions, accurately replicating a production environment.</w:t>
       </w:r>
     </w:p>
     <w:p/>
     <w:p>
-      <w:pPr>
-        <w:pStyle w:val="Heading3"/>
-      </w:pPr>
-      <w:r>
-        <w:lastRenderedPageBreak/>
-        <w:t>Random Forest Baseline Evaluation</w:t>
+      <w:r>
+        <w:t xml:space="preserve">Best Practice 2 </w:t>
+      </w:r>
+      <w:r>
+        <w:t>-</w:t>
+      </w:r>
+      <w:r>
+        <w:t xml:space="preserve"> Appropriate Evaluation Metric for Imbalanced Data</w:t>
       </w:r>
     </w:p>
     <w:p>
       <w:r>
-        <w:t>The baseline Random Forest model was trained on this rigorously prepared data. Due to the imbalanced nature of the dataset, accuracy was discarded as an evaluation metric in favour of the F1-Score, which balances Precision and Recall. The baseline model achieved a strong initial F1-Score of 0.6873. By successfully identifying 122 True Positives (customers who accepted the loan) while containing False Positives to just 53, this model proves highly effective at reducing wasted marketing expenditure compared to the bank's previous untargeted campaign. This establishes a robust mathematical baseline before proceeding to secondary algorithms and hyperparameter tuning.</w:t>
-      </w:r>
-    </w:p>
-    <w:p/>
-    <w:p/>
-    <w:p>
-      <w:pPr>
-        <w:pStyle w:val="Heading2"/>
-      </w:pPr>
-      <w:r>
-        <w:t>Baseline Model 2: Support Vector Machine (SVM)</w:t>
-      </w:r>
-    </w:p>
-    <w:p>
-      <w:r>
-        <w:t>To establish a comparative baseline, a</w:t>
-      </w:r>
-      <w:r>
-        <w:t>n</w:t>
-      </w:r>
-      <w:r>
-        <w:t xml:space="preserve"> SVM was developed. Because SVMs rely on calculating the spatial distance between data points to form decision boundaries, the strict standardisation of continuous variables performed in the previous step was critical to prevent features with larger numerical ranges (such as Income or Mortgage Amount) from disproportionately dominating the algorithm.</w:t>
+        <w:t>With an 85/15 class split, a model predicting "reject" for every customer would achieve 85% accuracy</w:t>
+      </w:r>
+      <w:r>
+        <w:t>,</w:t>
+      </w:r>
+      <w:r>
+        <w:t xml:space="preserve"> a meaningless score. Accuracy was therefore discarded in favour of the F1-Score, the harmonic mean of Precision and Recall, which penalises models that neglect the minority class. Stratification was also applied at both the train/test split and within the 5-fold cross-validation to maintain the 85/15 ratio in every fold, ensuring the model </w:t>
+      </w:r>
+      <w:r>
+        <w:t xml:space="preserve">was </w:t>
+      </w:r>
+      <w:r>
+        <w:t>consistently trained and validated against a representative class distribution.</w:t>
       </w:r>
     </w:p>
     <w:p/>
     <w:p>
-      <w:pPr>
-        <w:pStyle w:val="Heading3"/>
-      </w:pPr>
-      <w:r>
-        <w:t>Baseline Model Comparison</w:t>
+      <w:r>
+        <w:t>Best Practice 3</w:t>
+      </w:r>
+      <w:r>
+        <w:t xml:space="preserve"> -</w:t>
+      </w:r>
+      <w:r>
+        <w:t xml:space="preserve"> Outlier Mitigation to Protect Distance-Based Algorithms</w:t>
       </w:r>
     </w:p>
     <w:p>
       <w:r>
-        <w:t xml:space="preserve">The baseline SVM achieved an F1-Score of 0.6901, marginally outperforming the Random Forest baseline of 0.6873. However, dissecting the underlying metrics reveals divergent predictive behaviours. The SVM demonstrated superior Precision (0.7284), yielding only 44 False Positives compared to the Random Forest's 53. This indicates the SVM is highly conservative, making it the optimal choice for strictly minimising wasted marketing expenditure. Conversely, the Random Forest achieved </w:t>
-      </w:r>
-      <w:r>
-        <w:t xml:space="preserve">a </w:t>
-      </w:r>
-      <w:r>
-        <w:t>higher Recall (0.6778), capturing more True Positives but at the cost of broader misclassification. Because both models exhibit strong foundational predictive capabilities against the imbalanced dataset, both will be advanced to the hyperparameter tuning phase to optimise their respective decision boundaries.</w:t>
-      </w:r>
-    </w:p>
-    <w:p/>
-    <w:p/>
-    <w:p>
-      <w:pPr>
-        <w:pStyle w:val="Heading2"/>
-      </w:pPr>
-      <w:r>
-        <w:t>Hyperparameter Tuning</w:t>
-      </w:r>
-    </w:p>
-    <w:p>
-      <w:r>
-        <w:t xml:space="preserve">To optimise the predictive capabilities of both baseline models, rigorous hyperparameter tuning was conducted using </w:t>
-      </w:r>
-      <w:proofErr w:type="spellStart"/>
-      <w:r>
-        <w:t>GridSearchCV</w:t>
-      </w:r>
-      <w:proofErr w:type="spellEnd"/>
-      <w:r>
-        <w:t>. A 5-fold cross-validation strategy was employed, strictly evaluating combinations against the F1-Score to ensure the algorithms were rewarded for balancing the imbalanced classes, rather than defaulting to majority-class accuracy. For the Random Forest, parameters including tree depth, split criterion, and estimator count were systematically evaluated. For the Support Vector Machine, a float range of regularisation parameters (C) was generated, alongside various kernel types and class weight configurations.</w:t>
-      </w:r>
-    </w:p>
-    <w:p/>
-    <w:p/>
-    <w:p>
-      <w:pPr>
-        <w:pStyle w:val="Heading2"/>
-      </w:pPr>
-      <w:r>
-        <w:lastRenderedPageBreak/>
-        <w:t>Final Champion Model Selection</w:t>
-      </w:r>
-    </w:p>
-    <w:p>
-      <w:r>
-        <w:t>Post-tuning, both algorithms demonstrated performance improvements. The Support Vector Machine achieved an optimised cross-validated F1-Score of 0.6988 using an RBF kernel and a C value of 2.0. However, the Random Forest clearly emerged as the champion model, achieving a superior F1-Score of 0.7133. The grid search identified that an ensemble of 100 estimators, constrained to a maximum depth of 10 using the Gini criterion, provided the optimal mathematical balance between Precision and Recall. The Random Forest's robust architectural ability to handle complex, non-linear categorical data proved highly adept at navigating the financial dataset, officially cementing it as the final predictive engine for the targeted marketing strategy.</w:t>
-      </w:r>
-    </w:p>
-    <w:p/>
-    <w:p/>
-    <w:p>
-      <w:pPr>
-        <w:pStyle w:val="Heading1"/>
-      </w:pPr>
-      <w:r>
-        <w:t>Evaluatio</w:t>
-      </w:r>
-      <w:r>
-        <w:t>n</w:t>
-      </w:r>
-    </w:p>
-    <w:p>
-      <w:pPr>
-        <w:pStyle w:val="Heading2"/>
-      </w:pPr>
-      <w:r>
-        <w:t>Final Champion Model Evaluation</w:t>
-      </w:r>
-    </w:p>
-    <w:p>
-      <w:r>
-        <w:t>The mathematically optimised Random Forest champion model was evaluated against the unseen testing dataset to determine its real-world deployment viability. The model achieved a final F1-Score of 0.6891. Compared to the initial baseline, the hyperparameter tuning successfully increased Recall (from 0.6778 to 0.6833), meaning the algorithm correctly identified more customers who possessed a true propensity to accept the personal loan (123 True Positives).</w:t>
+        <w:t>SVM computes spatial decision boundaries; extreme values in high-magnitude features like Income and Mortgage Amount disproportionately distort those boundaries. The IQR method was applied during data preparation to cap such outliers, replacing values outside 1.5 × IQR bounds with the column median. Capping was chosen over deletion (preserves dataset size) and over boundary-value substitution (avoids introducing new extremes at the fence). This step was critical to ensuring the SVM baseline received mathematically stable inputs.</w:t>
       </w:r>
     </w:p>
     <w:p/>
     <w:p>
       <w:r>
-        <w:t>While this expansion caused a negligible drop in Precision (generating 54 False Positives instead of 53), the overall harmonic mean (F1-Score) improved. In a commercial context, capturing additional revenue-generating loans heavily outweighs the minor operational cost of an extra misdirected marketing communication. The model missed only 57 prospects (False Negatives) and correctly ignored 966 uninterested customers (True Negatives). This proves the algorithm successfully mapped the complex, imbalanced decision boundaries and is highly capable of driving a targeted, cost-efficient marketing strategy.</w:t>
-      </w:r>
-    </w:p>
-    <w:p/>
-    <w:p/>
-    <w:p>
-      <w:pPr>
-        <w:pStyle w:val="Heading1"/>
-      </w:pPr>
-      <w:r>
-        <w:t>Best Practices and Deployment</w:t>
+        <w:t xml:space="preserve">Best Practice 4 </w:t>
+      </w:r>
+      <w:r>
+        <w:t>-</w:t>
+      </w:r>
+      <w:r>
+        <w:t xml:space="preserve"> Empirical Testing of Theoretical Assumptions</w:t>
       </w:r>
     </w:p>
     <w:p>
-      <w:pPr>
-        <w:pStyle w:val="Heading2"/>
-      </w:pPr>
-      <w:r>
-        <w:t>Deployment Strategy and Best Practices</w:t>
-      </w:r>
-    </w:p>
-    <w:p>
-      <w:r>
-        <w:t>To successfully operationalise this predictive model, Crédit Nationale Azur must integrate the algorithm into its existing Customer Relationship Management (CRM) infrastructure. Data engineering best practices dictate that a strict, automated data pipeline must be established to clean and format new customer profiles exactly as they were prepared in Phase 3 (specifically applying median imputation and IQR outlier capping) before feeding the data into the model.</w:t>
+      <w:r>
+        <w:t>The standard assumption that dimensionality reduction improves generalisation was treated as a hypothesis to be tested, not an axiom to be accepted. By running parallel modelling tracks</w:t>
+      </w:r>
+      <w:r>
+        <w:t>,</w:t>
+      </w:r>
+      <w:r>
+        <w:t xml:space="preserve"> </w:t>
+      </w:r>
+      <w:proofErr w:type="spellStart"/>
+      <w:r>
+        <w:t>SelectKBest</w:t>
+      </w:r>
+      <w:proofErr w:type="spellEnd"/>
+      <w:r>
+        <w:t>(chi2, k=7) versus all 23 features</w:t>
+      </w:r>
+      <w:r>
+        <w:t>,</w:t>
+      </w:r>
+      <w:r>
+        <w:t xml:space="preserve"> across both algorithms, the analysis produced an evidence-based finding: forced feature selection harmed Random Forest performance and caused SVM to fail catastrophically. This empirical comparison prevented deploying an artificially handicapped model and validates the architectural decision to retain all features.</w:t>
       </w:r>
     </w:p>
     <w:p/>
     <w:p>
       <w:r>
-        <w:lastRenderedPageBreak/>
-        <w:t>Furthermore, model degradation (concept drift) is a known risk in financial machine learning. As economic conditions, interest rates, and customer spending habits evolve, the model's predictive accuracy will naturally decay. It is a critical best practice to implement a continuous monitoring framework. The model should be retrained annually using fresh campaign data, subjecting it to the same strict CRISP-DM methodology outlined in this report to ensure the targeted marketing strategy remains highly profitable.</w:t>
-      </w:r>
-    </w:p>
-    <w:bookmarkEnd w:id="2"/>
-    <w:bookmarkEnd w:id="3"/>
-    <w:p/>
-    <w:p/>
-    <w:p/>
-    <w:p/>
-    <w:p/>
-    <w:p/>
-    <w:p/>
-    <w:bookmarkEnd w:id="4"/>
-    <w:bookmarkEnd w:id="5"/>
-    <w:p/>
-    <w:p/>
-    <w:p/>
-    <w:p/>
-    <w:p/>
-    <w:p/>
-    <w:p/>
-    <w:p/>
-    <w:p/>
-    <w:p/>
-    <w:p/>
-    <w:p/>
-    <w:p/>
-    <w:p/>
-    <w:p/>
-    <w:p/>
-    <w:p/>
-    <w:p/>
-    <w:p/>
-    <w:p/>
-    <w:p/>
-    <w:p/>
-    <w:p/>
-    <w:p/>
-    <w:p/>
-    <w:p/>
-    <w:p/>
-    <w:p/>
-    <w:p/>
-    <w:p/>
-    <w:p>
-      <w:pPr>
-        <w:pStyle w:val="Heading1"/>
-        <w:rPr>
-          <w:rFonts w:ascii="Times New Roman" w:hAnsi="Times New Roman" w:cs="Times New Roman"/>
-        </w:rPr>
-      </w:pPr>
-      <w:bookmarkStart w:id="6" w:name="_Toc231052937"/>
-      <w:r>
-        <w:rPr>
-          <w:rFonts w:ascii="Times New Roman" w:hAnsi="Times New Roman" w:cs="Times New Roman"/>
-        </w:rPr>
-        <w:lastRenderedPageBreak/>
-        <w:t>References</w:t>
-      </w:r>
-      <w:bookmarkEnd w:id="6"/>
+        <w:t xml:space="preserve">Best Practice 5 </w:t>
+      </w:r>
+      <w:r>
+        <w:t>-</w:t>
+      </w:r>
+      <w:r>
+        <w:t xml:space="preserve"> Systematic Hyperparameter Tuning via Cross-Validation</w:t>
+      </w:r>
     </w:p>
     <w:p>
-      <w:pPr>
-        <w:rPr>
-          <w:rFonts w:ascii="Times New Roman" w:hAnsi="Times New Roman" w:cs="Times New Roman"/>
-        </w:rPr>
-      </w:pPr>
-    </w:p>
-    <w:p>
-      <w:pPr>
-        <w:rPr>
-          <w:rFonts w:ascii="Times New Roman" w:hAnsi="Times New Roman" w:cs="Times New Roman"/>
-        </w:rPr>
-      </w:pPr>
+      <w:r>
+        <w:t xml:space="preserve">Default algorithm parameters rarely yield optimal results for imbalanced business problems. </w:t>
+      </w:r>
+      <w:proofErr w:type="spellStart"/>
+      <w:r>
+        <w:t>GridSearchCV</w:t>
+      </w:r>
+      <w:proofErr w:type="spellEnd"/>
+      <w:r>
+        <w:t xml:space="preserve"> was applied across a predefined parameter grid for both algorithms and both feature tracks, scored against F1 under 5-fold stratified cross-validation. Each parameter combination was evaluated across five independently validated training folds, ensuring the selected configuration (</w:t>
+      </w:r>
+      <w:proofErr w:type="spellStart"/>
+      <w:r>
+        <w:t>n_estimators</w:t>
+      </w:r>
+      <w:proofErr w:type="spellEnd"/>
+      <w:r>
+        <w:t xml:space="preserve">=50, </w:t>
+      </w:r>
+      <w:proofErr w:type="spellStart"/>
+      <w:r>
+        <w:t>max_depth</w:t>
+      </w:r>
+      <w:proofErr w:type="spellEnd"/>
+      <w:r>
+        <w:t xml:space="preserve">=10, </w:t>
+      </w:r>
+      <w:proofErr w:type="spellStart"/>
+      <w:r>
+        <w:t>gini</w:t>
+      </w:r>
+      <w:proofErr w:type="spellEnd"/>
+      <w:r>
+        <w:t>) was chosen for its generalisation ability rather than its performance on any single data split</w:t>
+      </w:r>
+      <w:r>
+        <w:t>,</w:t>
+      </w:r>
+      <w:r>
+        <w:t xml:space="preserve"> directly addressing the bias-variance </w:t>
+      </w:r>
+      <w:proofErr w:type="spellStart"/>
+      <w:r>
+        <w:t>tradeoff</w:t>
+      </w:r>
+      <w:proofErr w:type="spellEnd"/>
+      <w:r>
+        <w:t>.</w:t>
+      </w:r>
     </w:p>
     <w:sectPr>
       <w:headerReference w:type="default" r:id="rId11"/>
@@ -2508,6 +3874,205 @@
     </w:lvl>
   </w:abstractNum>
   <w:abstractNum w:abstractNumId="2" w15:restartNumberingAfterBreak="0">
+    <w:nsid w:val="140C3284"/>
+    <w:multiLevelType w:val="hybridMultilevel"/>
+    <w:tmpl w:val="7DD6F664"/>
+    <w:lvl w:ilvl="0" w:tplc="0809000F">
+      <w:start w:val="1"/>
+      <w:numFmt w:val="decimal"/>
+      <w:lvlText w:val="%1."/>
+      <w:lvlJc w:val="left"/>
+      <w:pPr>
+        <w:ind w:left="720" w:hanging="360"/>
+      </w:pPr>
+    </w:lvl>
+    <w:lvl w:ilvl="1" w:tplc="08090019" w:tentative="1">
+      <w:start w:val="1"/>
+      <w:numFmt w:val="lowerLetter"/>
+      <w:lvlText w:val="%2."/>
+      <w:lvlJc w:val="left"/>
+      <w:pPr>
+        <w:ind w:left="1440" w:hanging="360"/>
+      </w:pPr>
+    </w:lvl>
+    <w:lvl w:ilvl="2" w:tplc="0809001B" w:tentative="1">
+      <w:start w:val="1"/>
+      <w:numFmt w:val="lowerRoman"/>
+      <w:lvlText w:val="%3."/>
+      <w:lvlJc w:val="right"/>
+      <w:pPr>
+        <w:ind w:left="2160" w:hanging="180"/>
+      </w:pPr>
+    </w:lvl>
+    <w:lvl w:ilvl="3" w:tplc="0809000F" w:tentative="1">
+      <w:start w:val="1"/>
+      <w:numFmt w:val="decimal"/>
+      <w:lvlText w:val="%4."/>
+      <w:lvlJc w:val="left"/>
+      <w:pPr>
+        <w:ind w:left="2880" w:hanging="360"/>
+      </w:pPr>
+    </w:lvl>
+    <w:lvl w:ilvl="4" w:tplc="08090019" w:tentative="1">
+      <w:start w:val="1"/>
+      <w:numFmt w:val="lowerLetter"/>
+      <w:lvlText w:val="%5."/>
+      <w:lvlJc w:val="left"/>
+      <w:pPr>
+        <w:ind w:left="3600" w:hanging="360"/>
+      </w:pPr>
+    </w:lvl>
+    <w:lvl w:ilvl="5" w:tplc="0809001B" w:tentative="1">
+      <w:start w:val="1"/>
+      <w:numFmt w:val="lowerRoman"/>
+      <w:lvlText w:val="%6."/>
+      <w:lvlJc w:val="right"/>
+      <w:pPr>
+        <w:ind w:left="4320" w:hanging="180"/>
+      </w:pPr>
+    </w:lvl>
+    <w:lvl w:ilvl="6" w:tplc="0809000F" w:tentative="1">
+      <w:start w:val="1"/>
+      <w:numFmt w:val="decimal"/>
+      <w:lvlText w:val="%7."/>
+      <w:lvlJc w:val="left"/>
+      <w:pPr>
+        <w:ind w:left="5040" w:hanging="360"/>
+      </w:pPr>
+    </w:lvl>
+    <w:lvl w:ilvl="7" w:tplc="08090019" w:tentative="1">
+      <w:start w:val="1"/>
+      <w:numFmt w:val="lowerLetter"/>
+      <w:lvlText w:val="%8."/>
+      <w:lvlJc w:val="left"/>
+      <w:pPr>
+        <w:ind w:left="5760" w:hanging="360"/>
+      </w:pPr>
+    </w:lvl>
+    <w:lvl w:ilvl="8" w:tplc="0809001B" w:tentative="1">
+      <w:start w:val="1"/>
+      <w:numFmt w:val="lowerRoman"/>
+      <w:lvlText w:val="%9."/>
+      <w:lvlJc w:val="right"/>
+      <w:pPr>
+        <w:ind w:left="6480" w:hanging="180"/>
+      </w:pPr>
+    </w:lvl>
+  </w:abstractNum>
+  <w:abstractNum w:abstractNumId="3" w15:restartNumberingAfterBreak="0">
+    <w:nsid w:val="1E2537EF"/>
+    <w:multiLevelType w:val="hybridMultilevel"/>
+    <w:tmpl w:val="F4F4D8FA"/>
+    <w:lvl w:ilvl="0" w:tplc="08090001">
+      <w:start w:val="1"/>
+      <w:numFmt w:val="bullet"/>
+      <w:lvlText w:val=""/>
+      <w:lvlJc w:val="left"/>
+      <w:pPr>
+        <w:ind w:left="720" w:hanging="360"/>
+      </w:pPr>
+      <w:rPr>
+        <w:rFonts w:ascii="Symbol" w:hAnsi="Symbol" w:hint="default"/>
+      </w:rPr>
+    </w:lvl>
+    <w:lvl w:ilvl="1" w:tplc="08090003" w:tentative="1">
+      <w:start w:val="1"/>
+      <w:numFmt w:val="bullet"/>
+      <w:lvlText w:val="o"/>
+      <w:lvlJc w:val="left"/>
+      <w:pPr>
+        <w:ind w:left="1440" w:hanging="360"/>
+      </w:pPr>
+      <w:rPr>
+        <w:rFonts w:ascii="Courier New" w:hAnsi="Courier New" w:cs="Courier New" w:hint="default"/>
+      </w:rPr>
+    </w:lvl>
+    <w:lvl w:ilvl="2" w:tplc="08090005" w:tentative="1">
+      <w:start w:val="1"/>
+      <w:numFmt w:val="bullet"/>
+      <w:lvlText w:val=""/>
+      <w:lvlJc w:val="left"/>
+      <w:pPr>
+        <w:ind w:left="2160" w:hanging="360"/>
+      </w:pPr>
+      <w:rPr>
+        <w:rFonts w:ascii="Wingdings" w:hAnsi="Wingdings" w:hint="default"/>
+      </w:rPr>
+    </w:lvl>
+    <w:lvl w:ilvl="3" w:tplc="08090001" w:tentative="1">
+      <w:start w:val="1"/>
+      <w:numFmt w:val="bullet"/>
+      <w:lvlText w:val=""/>
+      <w:lvlJc w:val="left"/>
+      <w:pPr>
+        <w:ind w:left="2880" w:hanging="360"/>
+      </w:pPr>
+      <w:rPr>
+        <w:rFonts w:ascii="Symbol" w:hAnsi="Symbol" w:hint="default"/>
+      </w:rPr>
+    </w:lvl>
+    <w:lvl w:ilvl="4" w:tplc="08090003" w:tentative="1">
+      <w:start w:val="1"/>
+      <w:numFmt w:val="bullet"/>
+      <w:lvlText w:val="o"/>
+      <w:lvlJc w:val="left"/>
+      <w:pPr>
+        <w:ind w:left="3600" w:hanging="360"/>
+      </w:pPr>
+      <w:rPr>
+        <w:rFonts w:ascii="Courier New" w:hAnsi="Courier New" w:cs="Courier New" w:hint="default"/>
+      </w:rPr>
+    </w:lvl>
+    <w:lvl w:ilvl="5" w:tplc="08090005" w:tentative="1">
+      <w:start w:val="1"/>
+      <w:numFmt w:val="bullet"/>
+      <w:lvlText w:val=""/>
+      <w:lvlJc w:val="left"/>
+      <w:pPr>
+        <w:ind w:left="4320" w:hanging="360"/>
+      </w:pPr>
+      <w:rPr>
+        <w:rFonts w:ascii="Wingdings" w:hAnsi="Wingdings" w:hint="default"/>
+      </w:rPr>
+    </w:lvl>
+    <w:lvl w:ilvl="6" w:tplc="08090001" w:tentative="1">
+      <w:start w:val="1"/>
+      <w:numFmt w:val="bullet"/>
+      <w:lvlText w:val=""/>
+      <w:lvlJc w:val="left"/>
+      <w:pPr>
+        <w:ind w:left="5040" w:hanging="360"/>
+      </w:pPr>
+      <w:rPr>
+        <w:rFonts w:ascii="Symbol" w:hAnsi="Symbol" w:hint="default"/>
+      </w:rPr>
+    </w:lvl>
+    <w:lvl w:ilvl="7" w:tplc="08090003" w:tentative="1">
+      <w:start w:val="1"/>
+      <w:numFmt w:val="bullet"/>
+      <w:lvlText w:val="o"/>
+      <w:lvlJc w:val="left"/>
+      <w:pPr>
+        <w:ind w:left="5760" w:hanging="360"/>
+      </w:pPr>
+      <w:rPr>
+        <w:rFonts w:ascii="Courier New" w:hAnsi="Courier New" w:cs="Courier New" w:hint="default"/>
+      </w:rPr>
+    </w:lvl>
+    <w:lvl w:ilvl="8" w:tplc="08090005" w:tentative="1">
+      <w:start w:val="1"/>
+      <w:numFmt w:val="bullet"/>
+      <w:lvlText w:val=""/>
+      <w:lvlJc w:val="left"/>
+      <w:pPr>
+        <w:ind w:left="6480" w:hanging="360"/>
+      </w:pPr>
+      <w:rPr>
+        <w:rFonts w:ascii="Wingdings" w:hAnsi="Wingdings" w:hint="default"/>
+      </w:rPr>
+    </w:lvl>
+  </w:abstractNum>
+  <w:abstractNum w:abstractNumId="4" w15:restartNumberingAfterBreak="0">
     <w:nsid w:val="22B77712"/>
     <w:multiLevelType w:val="multilevel"/>
     <w:tmpl w:val="7B502262"/>
@@ -2656,7 +4221,319 @@
       </w:rPr>
     </w:lvl>
   </w:abstractNum>
-  <w:abstractNum w:abstractNumId="3" w15:restartNumberingAfterBreak="0">
+  <w:abstractNum w:abstractNumId="5" w15:restartNumberingAfterBreak="0">
+    <w:nsid w:val="23385F38"/>
+    <w:multiLevelType w:val="hybridMultilevel"/>
+    <w:tmpl w:val="5CD27AB4"/>
+    <w:lvl w:ilvl="0" w:tplc="08090001">
+      <w:start w:val="1"/>
+      <w:numFmt w:val="bullet"/>
+      <w:lvlText w:val=""/>
+      <w:lvlJc w:val="left"/>
+      <w:pPr>
+        <w:ind w:left="720" w:hanging="360"/>
+      </w:pPr>
+      <w:rPr>
+        <w:rFonts w:ascii="Symbol" w:hAnsi="Symbol" w:hint="default"/>
+      </w:rPr>
+    </w:lvl>
+    <w:lvl w:ilvl="1" w:tplc="08090003">
+      <w:start w:val="1"/>
+      <w:numFmt w:val="bullet"/>
+      <w:lvlText w:val="o"/>
+      <w:lvlJc w:val="left"/>
+      <w:pPr>
+        <w:ind w:left="1440" w:hanging="360"/>
+      </w:pPr>
+      <w:rPr>
+        <w:rFonts w:ascii="Courier New" w:hAnsi="Courier New" w:cs="Courier New" w:hint="default"/>
+      </w:rPr>
+    </w:lvl>
+    <w:lvl w:ilvl="2" w:tplc="08090005" w:tentative="1">
+      <w:start w:val="1"/>
+      <w:numFmt w:val="bullet"/>
+      <w:lvlText w:val=""/>
+      <w:lvlJc w:val="left"/>
+      <w:pPr>
+        <w:ind w:left="2160" w:hanging="360"/>
+      </w:pPr>
+      <w:rPr>
+        <w:rFonts w:ascii="Wingdings" w:hAnsi="Wingdings" w:hint="default"/>
+      </w:rPr>
+    </w:lvl>
+    <w:lvl w:ilvl="3" w:tplc="08090001" w:tentative="1">
+      <w:start w:val="1"/>
+      <w:numFmt w:val="bullet"/>
+      <w:lvlText w:val=""/>
+      <w:lvlJc w:val="left"/>
+      <w:pPr>
+        <w:ind w:left="2880" w:hanging="360"/>
+      </w:pPr>
+      <w:rPr>
+        <w:rFonts w:ascii="Symbol" w:hAnsi="Symbol" w:hint="default"/>
+      </w:rPr>
+    </w:lvl>
+    <w:lvl w:ilvl="4" w:tplc="08090003" w:tentative="1">
+      <w:start w:val="1"/>
+      <w:numFmt w:val="bullet"/>
+      <w:lvlText w:val="o"/>
+      <w:lvlJc w:val="left"/>
+      <w:pPr>
+        <w:ind w:left="3600" w:hanging="360"/>
+      </w:pPr>
+      <w:rPr>
+        <w:rFonts w:ascii="Courier New" w:hAnsi="Courier New" w:cs="Courier New" w:hint="default"/>
+      </w:rPr>
+    </w:lvl>
+    <w:lvl w:ilvl="5" w:tplc="08090005" w:tentative="1">
+      <w:start w:val="1"/>
+      <w:numFmt w:val="bullet"/>
+      <w:lvlText w:val=""/>
+      <w:lvlJc w:val="left"/>
+      <w:pPr>
+        <w:ind w:left="4320" w:hanging="360"/>
+      </w:pPr>
+      <w:rPr>
+        <w:rFonts w:ascii="Wingdings" w:hAnsi="Wingdings" w:hint="default"/>
+      </w:rPr>
+    </w:lvl>
+    <w:lvl w:ilvl="6" w:tplc="08090001" w:tentative="1">
+      <w:start w:val="1"/>
+      <w:numFmt w:val="bullet"/>
+      <w:lvlText w:val=""/>
+      <w:lvlJc w:val="left"/>
+      <w:pPr>
+        <w:ind w:left="5040" w:hanging="360"/>
+      </w:pPr>
+      <w:rPr>
+        <w:rFonts w:ascii="Symbol" w:hAnsi="Symbol" w:hint="default"/>
+      </w:rPr>
+    </w:lvl>
+    <w:lvl w:ilvl="7" w:tplc="08090003" w:tentative="1">
+      <w:start w:val="1"/>
+      <w:numFmt w:val="bullet"/>
+      <w:lvlText w:val="o"/>
+      <w:lvlJc w:val="left"/>
+      <w:pPr>
+        <w:ind w:left="5760" w:hanging="360"/>
+      </w:pPr>
+      <w:rPr>
+        <w:rFonts w:ascii="Courier New" w:hAnsi="Courier New" w:cs="Courier New" w:hint="default"/>
+      </w:rPr>
+    </w:lvl>
+    <w:lvl w:ilvl="8" w:tplc="08090005" w:tentative="1">
+      <w:start w:val="1"/>
+      <w:numFmt w:val="bullet"/>
+      <w:lvlText w:val=""/>
+      <w:lvlJc w:val="left"/>
+      <w:pPr>
+        <w:ind w:left="6480" w:hanging="360"/>
+      </w:pPr>
+      <w:rPr>
+        <w:rFonts w:ascii="Wingdings" w:hAnsi="Wingdings" w:hint="default"/>
+      </w:rPr>
+    </w:lvl>
+  </w:abstractNum>
+  <w:abstractNum w:abstractNumId="6" w15:restartNumberingAfterBreak="0">
+    <w:nsid w:val="39011E5E"/>
+    <w:multiLevelType w:val="hybridMultilevel"/>
+    <w:tmpl w:val="7C76210C"/>
+    <w:lvl w:ilvl="0" w:tplc="0809000F">
+      <w:start w:val="1"/>
+      <w:numFmt w:val="decimal"/>
+      <w:lvlText w:val="%1."/>
+      <w:lvlJc w:val="left"/>
+      <w:pPr>
+        <w:ind w:left="720" w:hanging="360"/>
+      </w:pPr>
+    </w:lvl>
+    <w:lvl w:ilvl="1" w:tplc="08090019" w:tentative="1">
+      <w:start w:val="1"/>
+      <w:numFmt w:val="lowerLetter"/>
+      <w:lvlText w:val="%2."/>
+      <w:lvlJc w:val="left"/>
+      <w:pPr>
+        <w:ind w:left="1440" w:hanging="360"/>
+      </w:pPr>
+    </w:lvl>
+    <w:lvl w:ilvl="2" w:tplc="0809001B" w:tentative="1">
+      <w:start w:val="1"/>
+      <w:numFmt w:val="lowerRoman"/>
+      <w:lvlText w:val="%3."/>
+      <w:lvlJc w:val="right"/>
+      <w:pPr>
+        <w:ind w:left="2160" w:hanging="180"/>
+      </w:pPr>
+    </w:lvl>
+    <w:lvl w:ilvl="3" w:tplc="0809000F" w:tentative="1">
+      <w:start w:val="1"/>
+      <w:numFmt w:val="decimal"/>
+      <w:lvlText w:val="%4."/>
+      <w:lvlJc w:val="left"/>
+      <w:pPr>
+        <w:ind w:left="2880" w:hanging="360"/>
+      </w:pPr>
+    </w:lvl>
+    <w:lvl w:ilvl="4" w:tplc="08090019" w:tentative="1">
+      <w:start w:val="1"/>
+      <w:numFmt w:val="lowerLetter"/>
+      <w:lvlText w:val="%5."/>
+      <w:lvlJc w:val="left"/>
+      <w:pPr>
+        <w:ind w:left="3600" w:hanging="360"/>
+      </w:pPr>
+    </w:lvl>
+    <w:lvl w:ilvl="5" w:tplc="0809001B" w:tentative="1">
+      <w:start w:val="1"/>
+      <w:numFmt w:val="lowerRoman"/>
+      <w:lvlText w:val="%6."/>
+      <w:lvlJc w:val="right"/>
+      <w:pPr>
+        <w:ind w:left="4320" w:hanging="180"/>
+      </w:pPr>
+    </w:lvl>
+    <w:lvl w:ilvl="6" w:tplc="0809000F" w:tentative="1">
+      <w:start w:val="1"/>
+      <w:numFmt w:val="decimal"/>
+      <w:lvlText w:val="%7."/>
+      <w:lvlJc w:val="left"/>
+      <w:pPr>
+        <w:ind w:left="5040" w:hanging="360"/>
+      </w:pPr>
+    </w:lvl>
+    <w:lvl w:ilvl="7" w:tplc="08090019" w:tentative="1">
+      <w:start w:val="1"/>
+      <w:numFmt w:val="lowerLetter"/>
+      <w:lvlText w:val="%8."/>
+      <w:lvlJc w:val="left"/>
+      <w:pPr>
+        <w:ind w:left="5760" w:hanging="360"/>
+      </w:pPr>
+    </w:lvl>
+    <w:lvl w:ilvl="8" w:tplc="0809001B" w:tentative="1">
+      <w:start w:val="1"/>
+      <w:numFmt w:val="lowerRoman"/>
+      <w:lvlText w:val="%9."/>
+      <w:lvlJc w:val="right"/>
+      <w:pPr>
+        <w:ind w:left="6480" w:hanging="180"/>
+      </w:pPr>
+    </w:lvl>
+  </w:abstractNum>
+  <w:abstractNum w:abstractNumId="7" w15:restartNumberingAfterBreak="0">
+    <w:nsid w:val="39E66F42"/>
+    <w:multiLevelType w:val="hybridMultilevel"/>
+    <w:tmpl w:val="08E496DE"/>
+    <w:lvl w:ilvl="0" w:tplc="08090001">
+      <w:start w:val="1"/>
+      <w:numFmt w:val="bullet"/>
+      <w:lvlText w:val=""/>
+      <w:lvlJc w:val="left"/>
+      <w:pPr>
+        <w:ind w:left="720" w:hanging="360"/>
+      </w:pPr>
+      <w:rPr>
+        <w:rFonts w:ascii="Symbol" w:hAnsi="Symbol" w:hint="default"/>
+      </w:rPr>
+    </w:lvl>
+    <w:lvl w:ilvl="1" w:tplc="08090003" w:tentative="1">
+      <w:start w:val="1"/>
+      <w:numFmt w:val="bullet"/>
+      <w:lvlText w:val="o"/>
+      <w:lvlJc w:val="left"/>
+      <w:pPr>
+        <w:ind w:left="1440" w:hanging="360"/>
+      </w:pPr>
+      <w:rPr>
+        <w:rFonts w:ascii="Courier New" w:hAnsi="Courier New" w:cs="Courier New" w:hint="default"/>
+      </w:rPr>
+    </w:lvl>
+    <w:lvl w:ilvl="2" w:tplc="08090005" w:tentative="1">
+      <w:start w:val="1"/>
+      <w:numFmt w:val="bullet"/>
+      <w:lvlText w:val=""/>
+      <w:lvlJc w:val="left"/>
+      <w:pPr>
+        <w:ind w:left="2160" w:hanging="360"/>
+      </w:pPr>
+      <w:rPr>
+        <w:rFonts w:ascii="Wingdings" w:hAnsi="Wingdings" w:hint="default"/>
+      </w:rPr>
+    </w:lvl>
+    <w:lvl w:ilvl="3" w:tplc="08090001" w:tentative="1">
+      <w:start w:val="1"/>
+      <w:numFmt w:val="bullet"/>
+      <w:lvlText w:val=""/>
+      <w:lvlJc w:val="left"/>
+      <w:pPr>
+        <w:ind w:left="2880" w:hanging="360"/>
+      </w:pPr>
+      <w:rPr>
+        <w:rFonts w:ascii="Symbol" w:hAnsi="Symbol" w:hint="default"/>
+      </w:rPr>
+    </w:lvl>
+    <w:lvl w:ilvl="4" w:tplc="08090003" w:tentative="1">
+      <w:start w:val="1"/>
+      <w:numFmt w:val="bullet"/>
+      <w:lvlText w:val="o"/>
+      <w:lvlJc w:val="left"/>
+      <w:pPr>
+        <w:ind w:left="3600" w:hanging="360"/>
+      </w:pPr>
+      <w:rPr>
+        <w:rFonts w:ascii="Courier New" w:hAnsi="Courier New" w:cs="Courier New" w:hint="default"/>
+      </w:rPr>
+    </w:lvl>
+    <w:lvl w:ilvl="5" w:tplc="08090005" w:tentative="1">
+      <w:start w:val="1"/>
+      <w:numFmt w:val="bullet"/>
+      <w:lvlText w:val=""/>
+      <w:lvlJc w:val="left"/>
+      <w:pPr>
+        <w:ind w:left="4320" w:hanging="360"/>
+      </w:pPr>
+      <w:rPr>
+        <w:rFonts w:ascii="Wingdings" w:hAnsi="Wingdings" w:hint="default"/>
+      </w:rPr>
+    </w:lvl>
+    <w:lvl w:ilvl="6" w:tplc="08090001" w:tentative="1">
+      <w:start w:val="1"/>
+      <w:numFmt w:val="bullet"/>
+      <w:lvlText w:val=""/>
+      <w:lvlJc w:val="left"/>
+      <w:pPr>
+        <w:ind w:left="5040" w:hanging="360"/>
+      </w:pPr>
+      <w:rPr>
+        <w:rFonts w:ascii="Symbol" w:hAnsi="Symbol" w:hint="default"/>
+      </w:rPr>
+    </w:lvl>
+    <w:lvl w:ilvl="7" w:tplc="08090003" w:tentative="1">
+      <w:start w:val="1"/>
+      <w:numFmt w:val="bullet"/>
+      <w:lvlText w:val="o"/>
+      <w:lvlJc w:val="left"/>
+      <w:pPr>
+        <w:ind w:left="5760" w:hanging="360"/>
+      </w:pPr>
+      <w:rPr>
+        <w:rFonts w:ascii="Courier New" w:hAnsi="Courier New" w:cs="Courier New" w:hint="default"/>
+      </w:rPr>
+    </w:lvl>
+    <w:lvl w:ilvl="8" w:tplc="08090005" w:tentative="1">
+      <w:start w:val="1"/>
+      <w:numFmt w:val="bullet"/>
+      <w:lvlText w:val=""/>
+      <w:lvlJc w:val="left"/>
+      <w:pPr>
+        <w:ind w:left="6480" w:hanging="360"/>
+      </w:pPr>
+      <w:rPr>
+        <w:rFonts w:ascii="Wingdings" w:hAnsi="Wingdings" w:hint="default"/>
+      </w:rPr>
+    </w:lvl>
+  </w:abstractNum>
+  <w:abstractNum w:abstractNumId="8" w15:restartNumberingAfterBreak="0">
     <w:nsid w:val="3A0E7073"/>
     <w:multiLevelType w:val="multilevel"/>
     <w:tmpl w:val="98C4FD6A"/>
@@ -2805,7 +4682,206 @@
       </w:rPr>
     </w:lvl>
   </w:abstractNum>
-  <w:abstractNum w:abstractNumId="4" w15:restartNumberingAfterBreak="0">
+  <w:abstractNum w:abstractNumId="9" w15:restartNumberingAfterBreak="0">
+    <w:nsid w:val="3A994D46"/>
+    <w:multiLevelType w:val="hybridMultilevel"/>
+    <w:tmpl w:val="5D50523A"/>
+    <w:lvl w:ilvl="0" w:tplc="0809000F">
+      <w:start w:val="1"/>
+      <w:numFmt w:val="decimal"/>
+      <w:lvlText w:val="%1."/>
+      <w:lvlJc w:val="left"/>
+      <w:pPr>
+        <w:ind w:left="720" w:hanging="360"/>
+      </w:pPr>
+    </w:lvl>
+    <w:lvl w:ilvl="1" w:tplc="08090019" w:tentative="1">
+      <w:start w:val="1"/>
+      <w:numFmt w:val="lowerLetter"/>
+      <w:lvlText w:val="%2."/>
+      <w:lvlJc w:val="left"/>
+      <w:pPr>
+        <w:ind w:left="1440" w:hanging="360"/>
+      </w:pPr>
+    </w:lvl>
+    <w:lvl w:ilvl="2" w:tplc="0809001B" w:tentative="1">
+      <w:start w:val="1"/>
+      <w:numFmt w:val="lowerRoman"/>
+      <w:lvlText w:val="%3."/>
+      <w:lvlJc w:val="right"/>
+      <w:pPr>
+        <w:ind w:left="2160" w:hanging="180"/>
+      </w:pPr>
+    </w:lvl>
+    <w:lvl w:ilvl="3" w:tplc="0809000F" w:tentative="1">
+      <w:start w:val="1"/>
+      <w:numFmt w:val="decimal"/>
+      <w:lvlText w:val="%4."/>
+      <w:lvlJc w:val="left"/>
+      <w:pPr>
+        <w:ind w:left="2880" w:hanging="360"/>
+      </w:pPr>
+    </w:lvl>
+    <w:lvl w:ilvl="4" w:tplc="08090019" w:tentative="1">
+      <w:start w:val="1"/>
+      <w:numFmt w:val="lowerLetter"/>
+      <w:lvlText w:val="%5."/>
+      <w:lvlJc w:val="left"/>
+      <w:pPr>
+        <w:ind w:left="3600" w:hanging="360"/>
+      </w:pPr>
+    </w:lvl>
+    <w:lvl w:ilvl="5" w:tplc="0809001B" w:tentative="1">
+      <w:start w:val="1"/>
+      <w:numFmt w:val="lowerRoman"/>
+      <w:lvlText w:val="%6."/>
+      <w:lvlJc w:val="right"/>
+      <w:pPr>
+        <w:ind w:left="4320" w:hanging="180"/>
+      </w:pPr>
+    </w:lvl>
+    <w:lvl w:ilvl="6" w:tplc="0809000F" w:tentative="1">
+      <w:start w:val="1"/>
+      <w:numFmt w:val="decimal"/>
+      <w:lvlText w:val="%7."/>
+      <w:lvlJc w:val="left"/>
+      <w:pPr>
+        <w:ind w:left="5040" w:hanging="360"/>
+      </w:pPr>
+    </w:lvl>
+    <w:lvl w:ilvl="7" w:tplc="08090019" w:tentative="1">
+      <w:start w:val="1"/>
+      <w:numFmt w:val="lowerLetter"/>
+      <w:lvlText w:val="%8."/>
+      <w:lvlJc w:val="left"/>
+      <w:pPr>
+        <w:ind w:left="5760" w:hanging="360"/>
+      </w:pPr>
+    </w:lvl>
+    <w:lvl w:ilvl="8" w:tplc="0809001B" w:tentative="1">
+      <w:start w:val="1"/>
+      <w:numFmt w:val="lowerRoman"/>
+      <w:lvlText w:val="%9."/>
+      <w:lvlJc w:val="right"/>
+      <w:pPr>
+        <w:ind w:left="6480" w:hanging="180"/>
+      </w:pPr>
+    </w:lvl>
+  </w:abstractNum>
+  <w:abstractNum w:abstractNumId="10" w15:restartNumberingAfterBreak="0">
+    <w:nsid w:val="46310E0A"/>
+    <w:multiLevelType w:val="hybridMultilevel"/>
+    <w:tmpl w:val="82E2A7F6"/>
+    <w:lvl w:ilvl="0" w:tplc="08090001">
+      <w:start w:val="1"/>
+      <w:numFmt w:val="bullet"/>
+      <w:lvlText w:val=""/>
+      <w:lvlJc w:val="left"/>
+      <w:pPr>
+        <w:ind w:left="720" w:hanging="360"/>
+      </w:pPr>
+      <w:rPr>
+        <w:rFonts w:ascii="Symbol" w:hAnsi="Symbol" w:hint="default"/>
+      </w:rPr>
+    </w:lvl>
+    <w:lvl w:ilvl="1" w:tplc="08090003" w:tentative="1">
+      <w:start w:val="1"/>
+      <w:numFmt w:val="bullet"/>
+      <w:lvlText w:val="o"/>
+      <w:lvlJc w:val="left"/>
+      <w:pPr>
+        <w:ind w:left="1440" w:hanging="360"/>
+      </w:pPr>
+      <w:rPr>
+        <w:rFonts w:ascii="Courier New" w:hAnsi="Courier New" w:cs="Courier New" w:hint="default"/>
+      </w:rPr>
+    </w:lvl>
+    <w:lvl w:ilvl="2" w:tplc="08090005" w:tentative="1">
+      <w:start w:val="1"/>
+      <w:numFmt w:val="bullet"/>
+      <w:lvlText w:val=""/>
+      <w:lvlJc w:val="left"/>
+      <w:pPr>
+        <w:ind w:left="2160" w:hanging="360"/>
+      </w:pPr>
+      <w:rPr>
+        <w:rFonts w:ascii="Wingdings" w:hAnsi="Wingdings" w:hint="default"/>
+      </w:rPr>
+    </w:lvl>
+    <w:lvl w:ilvl="3" w:tplc="08090001" w:tentative="1">
+      <w:start w:val="1"/>
+      <w:numFmt w:val="bullet"/>
+      <w:lvlText w:val=""/>
+      <w:lvlJc w:val="left"/>
+      <w:pPr>
+        <w:ind w:left="2880" w:hanging="360"/>
+      </w:pPr>
+      <w:rPr>
+        <w:rFonts w:ascii="Symbol" w:hAnsi="Symbol" w:hint="default"/>
+      </w:rPr>
+    </w:lvl>
+    <w:lvl w:ilvl="4" w:tplc="08090003" w:tentative="1">
+      <w:start w:val="1"/>
+      <w:numFmt w:val="bullet"/>
+      <w:lvlText w:val="o"/>
+      <w:lvlJc w:val="left"/>
+      <w:pPr>
+        <w:ind w:left="3600" w:hanging="360"/>
+      </w:pPr>
+      <w:rPr>
+        <w:rFonts w:ascii="Courier New" w:hAnsi="Courier New" w:cs="Courier New" w:hint="default"/>
+      </w:rPr>
+    </w:lvl>
+    <w:lvl w:ilvl="5" w:tplc="08090005" w:tentative="1">
+      <w:start w:val="1"/>
+      <w:numFmt w:val="bullet"/>
+      <w:lvlText w:val=""/>
+      <w:lvlJc w:val="left"/>
+      <w:pPr>
+        <w:ind w:left="4320" w:hanging="360"/>
+      </w:pPr>
+      <w:rPr>
+        <w:rFonts w:ascii="Wingdings" w:hAnsi="Wingdings" w:hint="default"/>
+      </w:rPr>
+    </w:lvl>
+    <w:lvl w:ilvl="6" w:tplc="08090001" w:tentative="1">
+      <w:start w:val="1"/>
+      <w:numFmt w:val="bullet"/>
+      <w:lvlText w:val=""/>
+      <w:lvlJc w:val="left"/>
+      <w:pPr>
+        <w:ind w:left="5040" w:hanging="360"/>
+      </w:pPr>
+      <w:rPr>
+        <w:rFonts w:ascii="Symbol" w:hAnsi="Symbol" w:hint="default"/>
+      </w:rPr>
+    </w:lvl>
+    <w:lvl w:ilvl="7" w:tplc="08090003" w:tentative="1">
+      <w:start w:val="1"/>
+      <w:numFmt w:val="bullet"/>
+      <w:lvlText w:val="o"/>
+      <w:lvlJc w:val="left"/>
+      <w:pPr>
+        <w:ind w:left="5760" w:hanging="360"/>
+      </w:pPr>
+      <w:rPr>
+        <w:rFonts w:ascii="Courier New" w:hAnsi="Courier New" w:cs="Courier New" w:hint="default"/>
+      </w:rPr>
+    </w:lvl>
+    <w:lvl w:ilvl="8" w:tplc="08090005" w:tentative="1">
+      <w:start w:val="1"/>
+      <w:numFmt w:val="bullet"/>
+      <w:lvlText w:val=""/>
+      <w:lvlJc w:val="left"/>
+      <w:pPr>
+        <w:ind w:left="6480" w:hanging="360"/>
+      </w:pPr>
+      <w:rPr>
+        <w:rFonts w:ascii="Wingdings" w:hAnsi="Wingdings" w:hint="default"/>
+      </w:rPr>
+    </w:lvl>
+  </w:abstractNum>
+  <w:abstractNum w:abstractNumId="11" w15:restartNumberingAfterBreak="0">
     <w:nsid w:val="4E8213E2"/>
     <w:multiLevelType w:val="multilevel"/>
     <w:tmpl w:val="01EACC06"/>
@@ -2918,7 +4994,233 @@
       </w:pPr>
     </w:lvl>
   </w:abstractNum>
-  <w:abstractNum w:abstractNumId="5" w15:restartNumberingAfterBreak="0">
+  <w:abstractNum w:abstractNumId="12" w15:restartNumberingAfterBreak="0">
+    <w:nsid w:val="54243DE1"/>
+    <w:multiLevelType w:val="hybridMultilevel"/>
+    <w:tmpl w:val="316C848E"/>
+    <w:lvl w:ilvl="0" w:tplc="08090001">
+      <w:start w:val="1"/>
+      <w:numFmt w:val="bullet"/>
+      <w:lvlText w:val=""/>
+      <w:lvlJc w:val="left"/>
+      <w:pPr>
+        <w:ind w:left="720" w:hanging="360"/>
+      </w:pPr>
+      <w:rPr>
+        <w:rFonts w:ascii="Symbol" w:hAnsi="Symbol" w:hint="default"/>
+      </w:rPr>
+    </w:lvl>
+    <w:lvl w:ilvl="1" w:tplc="08090003" w:tentative="1">
+      <w:start w:val="1"/>
+      <w:numFmt w:val="bullet"/>
+      <w:lvlText w:val="o"/>
+      <w:lvlJc w:val="left"/>
+      <w:pPr>
+        <w:ind w:left="1440" w:hanging="360"/>
+      </w:pPr>
+      <w:rPr>
+        <w:rFonts w:ascii="Courier New" w:hAnsi="Courier New" w:cs="Courier New" w:hint="default"/>
+      </w:rPr>
+    </w:lvl>
+    <w:lvl w:ilvl="2" w:tplc="08090005" w:tentative="1">
+      <w:start w:val="1"/>
+      <w:numFmt w:val="bullet"/>
+      <w:lvlText w:val=""/>
+      <w:lvlJc w:val="left"/>
+      <w:pPr>
+        <w:ind w:left="2160" w:hanging="360"/>
+      </w:pPr>
+      <w:rPr>
+        <w:rFonts w:ascii="Wingdings" w:hAnsi="Wingdings" w:hint="default"/>
+      </w:rPr>
+    </w:lvl>
+    <w:lvl w:ilvl="3" w:tplc="08090001" w:tentative="1">
+      <w:start w:val="1"/>
+      <w:numFmt w:val="bullet"/>
+      <w:lvlText w:val=""/>
+      <w:lvlJc w:val="left"/>
+      <w:pPr>
+        <w:ind w:left="2880" w:hanging="360"/>
+      </w:pPr>
+      <w:rPr>
+        <w:rFonts w:ascii="Symbol" w:hAnsi="Symbol" w:hint="default"/>
+      </w:rPr>
+    </w:lvl>
+    <w:lvl w:ilvl="4" w:tplc="08090003" w:tentative="1">
+      <w:start w:val="1"/>
+      <w:numFmt w:val="bullet"/>
+      <w:lvlText w:val="o"/>
+      <w:lvlJc w:val="left"/>
+      <w:pPr>
+        <w:ind w:left="3600" w:hanging="360"/>
+      </w:pPr>
+      <w:rPr>
+        <w:rFonts w:ascii="Courier New" w:hAnsi="Courier New" w:cs="Courier New" w:hint="default"/>
+      </w:rPr>
+    </w:lvl>
+    <w:lvl w:ilvl="5" w:tplc="08090005" w:tentative="1">
+      <w:start w:val="1"/>
+      <w:numFmt w:val="bullet"/>
+      <w:lvlText w:val=""/>
+      <w:lvlJc w:val="left"/>
+      <w:pPr>
+        <w:ind w:left="4320" w:hanging="360"/>
+      </w:pPr>
+      <w:rPr>
+        <w:rFonts w:ascii="Wingdings" w:hAnsi="Wingdings" w:hint="default"/>
+      </w:rPr>
+    </w:lvl>
+    <w:lvl w:ilvl="6" w:tplc="08090001" w:tentative="1">
+      <w:start w:val="1"/>
+      <w:numFmt w:val="bullet"/>
+      <w:lvlText w:val=""/>
+      <w:lvlJc w:val="left"/>
+      <w:pPr>
+        <w:ind w:left="5040" w:hanging="360"/>
+      </w:pPr>
+      <w:rPr>
+        <w:rFonts w:ascii="Symbol" w:hAnsi="Symbol" w:hint="default"/>
+      </w:rPr>
+    </w:lvl>
+    <w:lvl w:ilvl="7" w:tplc="08090003" w:tentative="1">
+      <w:start w:val="1"/>
+      <w:numFmt w:val="bullet"/>
+      <w:lvlText w:val="o"/>
+      <w:lvlJc w:val="left"/>
+      <w:pPr>
+        <w:ind w:left="5760" w:hanging="360"/>
+      </w:pPr>
+      <w:rPr>
+        <w:rFonts w:ascii="Courier New" w:hAnsi="Courier New" w:cs="Courier New" w:hint="default"/>
+      </w:rPr>
+    </w:lvl>
+    <w:lvl w:ilvl="8" w:tplc="08090005" w:tentative="1">
+      <w:start w:val="1"/>
+      <w:numFmt w:val="bullet"/>
+      <w:lvlText w:val=""/>
+      <w:lvlJc w:val="left"/>
+      <w:pPr>
+        <w:ind w:left="6480" w:hanging="360"/>
+      </w:pPr>
+      <w:rPr>
+        <w:rFonts w:ascii="Wingdings" w:hAnsi="Wingdings" w:hint="default"/>
+      </w:rPr>
+    </w:lvl>
+  </w:abstractNum>
+  <w:abstractNum w:abstractNumId="13" w15:restartNumberingAfterBreak="0">
+    <w:nsid w:val="57BE6689"/>
+    <w:multiLevelType w:val="hybridMultilevel"/>
+    <w:tmpl w:val="A56EE896"/>
+    <w:lvl w:ilvl="0" w:tplc="08090001">
+      <w:start w:val="1"/>
+      <w:numFmt w:val="bullet"/>
+      <w:lvlText w:val=""/>
+      <w:lvlJc w:val="left"/>
+      <w:pPr>
+        <w:ind w:left="720" w:hanging="360"/>
+      </w:pPr>
+      <w:rPr>
+        <w:rFonts w:ascii="Symbol" w:hAnsi="Symbol" w:hint="default"/>
+      </w:rPr>
+    </w:lvl>
+    <w:lvl w:ilvl="1" w:tplc="08090003" w:tentative="1">
+      <w:start w:val="1"/>
+      <w:numFmt w:val="bullet"/>
+      <w:lvlText w:val="o"/>
+      <w:lvlJc w:val="left"/>
+      <w:pPr>
+        <w:ind w:left="1440" w:hanging="360"/>
+      </w:pPr>
+      <w:rPr>
+        <w:rFonts w:ascii="Courier New" w:hAnsi="Courier New" w:cs="Courier New" w:hint="default"/>
+      </w:rPr>
+    </w:lvl>
+    <w:lvl w:ilvl="2" w:tplc="08090005" w:tentative="1">
+      <w:start w:val="1"/>
+      <w:numFmt w:val="bullet"/>
+      <w:lvlText w:val=""/>
+      <w:lvlJc w:val="left"/>
+      <w:pPr>
+        <w:ind w:left="2160" w:hanging="360"/>
+      </w:pPr>
+      <w:rPr>
+        <w:rFonts w:ascii="Wingdings" w:hAnsi="Wingdings" w:hint="default"/>
+      </w:rPr>
+    </w:lvl>
+    <w:lvl w:ilvl="3" w:tplc="08090001" w:tentative="1">
+      <w:start w:val="1"/>
+      <w:numFmt w:val="bullet"/>
+      <w:lvlText w:val=""/>
+      <w:lvlJc w:val="left"/>
+      <w:pPr>
+        <w:ind w:left="2880" w:hanging="360"/>
+      </w:pPr>
+      <w:rPr>
+        <w:rFonts w:ascii="Symbol" w:hAnsi="Symbol" w:hint="default"/>
+      </w:rPr>
+    </w:lvl>
+    <w:lvl w:ilvl="4" w:tplc="08090003" w:tentative="1">
+      <w:start w:val="1"/>
+      <w:numFmt w:val="bullet"/>
+      <w:lvlText w:val="o"/>
+      <w:lvlJc w:val="left"/>
+      <w:pPr>
+        <w:ind w:left="3600" w:hanging="360"/>
+      </w:pPr>
+      <w:rPr>
+        <w:rFonts w:ascii="Courier New" w:hAnsi="Courier New" w:cs="Courier New" w:hint="default"/>
+      </w:rPr>
+    </w:lvl>
+    <w:lvl w:ilvl="5" w:tplc="08090005" w:tentative="1">
+      <w:start w:val="1"/>
+      <w:numFmt w:val="bullet"/>
+      <w:lvlText w:val=""/>
+      <w:lvlJc w:val="left"/>
+      <w:pPr>
+        <w:ind w:left="4320" w:hanging="360"/>
+      </w:pPr>
+      <w:rPr>
+        <w:rFonts w:ascii="Wingdings" w:hAnsi="Wingdings" w:hint="default"/>
+      </w:rPr>
+    </w:lvl>
+    <w:lvl w:ilvl="6" w:tplc="08090001" w:tentative="1">
+      <w:start w:val="1"/>
+      <w:numFmt w:val="bullet"/>
+      <w:lvlText w:val=""/>
+      <w:lvlJc w:val="left"/>
+      <w:pPr>
+        <w:ind w:left="5040" w:hanging="360"/>
+      </w:pPr>
+      <w:rPr>
+        <w:rFonts w:ascii="Symbol" w:hAnsi="Symbol" w:hint="default"/>
+      </w:rPr>
+    </w:lvl>
+    <w:lvl w:ilvl="7" w:tplc="08090003" w:tentative="1">
+      <w:start w:val="1"/>
+      <w:numFmt w:val="bullet"/>
+      <w:lvlText w:val="o"/>
+      <w:lvlJc w:val="left"/>
+      <w:pPr>
+        <w:ind w:left="5760" w:hanging="360"/>
+      </w:pPr>
+      <w:rPr>
+        <w:rFonts w:ascii="Courier New" w:hAnsi="Courier New" w:cs="Courier New" w:hint="default"/>
+      </w:rPr>
+    </w:lvl>
+    <w:lvl w:ilvl="8" w:tplc="08090005" w:tentative="1">
+      <w:start w:val="1"/>
+      <w:numFmt w:val="bullet"/>
+      <w:lvlText w:val=""/>
+      <w:lvlJc w:val="left"/>
+      <w:pPr>
+        <w:ind w:left="6480" w:hanging="360"/>
+      </w:pPr>
+      <w:rPr>
+        <w:rFonts w:ascii="Wingdings" w:hAnsi="Wingdings" w:hint="default"/>
+      </w:rPr>
+    </w:lvl>
+  </w:abstractNum>
+  <w:abstractNum w:abstractNumId="14" w15:restartNumberingAfterBreak="0">
     <w:nsid w:val="58F60B8A"/>
     <w:multiLevelType w:val="multilevel"/>
     <w:tmpl w:val="D658805E"/>
@@ -3067,7 +5369,120 @@
       </w:rPr>
     </w:lvl>
   </w:abstractNum>
-  <w:abstractNum w:abstractNumId="6" w15:restartNumberingAfterBreak="0">
+  <w:abstractNum w:abstractNumId="15" w15:restartNumberingAfterBreak="0">
+    <w:nsid w:val="686B3051"/>
+    <w:multiLevelType w:val="hybridMultilevel"/>
+    <w:tmpl w:val="B830BAEE"/>
+    <w:lvl w:ilvl="0" w:tplc="08090001">
+      <w:start w:val="1"/>
+      <w:numFmt w:val="bullet"/>
+      <w:lvlText w:val=""/>
+      <w:lvlJc w:val="left"/>
+      <w:pPr>
+        <w:ind w:left="720" w:hanging="360"/>
+      </w:pPr>
+      <w:rPr>
+        <w:rFonts w:ascii="Symbol" w:hAnsi="Symbol" w:hint="default"/>
+      </w:rPr>
+    </w:lvl>
+    <w:lvl w:ilvl="1" w:tplc="08090003" w:tentative="1">
+      <w:start w:val="1"/>
+      <w:numFmt w:val="bullet"/>
+      <w:lvlText w:val="o"/>
+      <w:lvlJc w:val="left"/>
+      <w:pPr>
+        <w:ind w:left="1440" w:hanging="360"/>
+      </w:pPr>
+      <w:rPr>
+        <w:rFonts w:ascii="Courier New" w:hAnsi="Courier New" w:cs="Courier New" w:hint="default"/>
+      </w:rPr>
+    </w:lvl>
+    <w:lvl w:ilvl="2" w:tplc="08090005" w:tentative="1">
+      <w:start w:val="1"/>
+      <w:numFmt w:val="bullet"/>
+      <w:lvlText w:val=""/>
+      <w:lvlJc w:val="left"/>
+      <w:pPr>
+        <w:ind w:left="2160" w:hanging="360"/>
+      </w:pPr>
+      <w:rPr>
+        <w:rFonts w:ascii="Wingdings" w:hAnsi="Wingdings" w:hint="default"/>
+      </w:rPr>
+    </w:lvl>
+    <w:lvl w:ilvl="3" w:tplc="08090001" w:tentative="1">
+      <w:start w:val="1"/>
+      <w:numFmt w:val="bullet"/>
+      <w:lvlText w:val=""/>
+      <w:lvlJc w:val="left"/>
+      <w:pPr>
+        <w:ind w:left="2880" w:hanging="360"/>
+      </w:pPr>
+      <w:rPr>
+        <w:rFonts w:ascii="Symbol" w:hAnsi="Symbol" w:hint="default"/>
+      </w:rPr>
+    </w:lvl>
+    <w:lvl w:ilvl="4" w:tplc="08090003" w:tentative="1">
+      <w:start w:val="1"/>
+      <w:numFmt w:val="bullet"/>
+      <w:lvlText w:val="o"/>
+      <w:lvlJc w:val="left"/>
+      <w:pPr>
+        <w:ind w:left="3600" w:hanging="360"/>
+      </w:pPr>
+      <w:rPr>
+        <w:rFonts w:ascii="Courier New" w:hAnsi="Courier New" w:cs="Courier New" w:hint="default"/>
+      </w:rPr>
+    </w:lvl>
+    <w:lvl w:ilvl="5" w:tplc="08090005" w:tentative="1">
+      <w:start w:val="1"/>
+      <w:numFmt w:val="bullet"/>
+      <w:lvlText w:val=""/>
+      <w:lvlJc w:val="left"/>
+      <w:pPr>
+        <w:ind w:left="4320" w:hanging="360"/>
+      </w:pPr>
+      <w:rPr>
+        <w:rFonts w:ascii="Wingdings" w:hAnsi="Wingdings" w:hint="default"/>
+      </w:rPr>
+    </w:lvl>
+    <w:lvl w:ilvl="6" w:tplc="08090001" w:tentative="1">
+      <w:start w:val="1"/>
+      <w:numFmt w:val="bullet"/>
+      <w:lvlText w:val=""/>
+      <w:lvlJc w:val="left"/>
+      <w:pPr>
+        <w:ind w:left="5040" w:hanging="360"/>
+      </w:pPr>
+      <w:rPr>
+        <w:rFonts w:ascii="Symbol" w:hAnsi="Symbol" w:hint="default"/>
+      </w:rPr>
+    </w:lvl>
+    <w:lvl w:ilvl="7" w:tplc="08090003" w:tentative="1">
+      <w:start w:val="1"/>
+      <w:numFmt w:val="bullet"/>
+      <w:lvlText w:val="o"/>
+      <w:lvlJc w:val="left"/>
+      <w:pPr>
+        <w:ind w:left="5760" w:hanging="360"/>
+      </w:pPr>
+      <w:rPr>
+        <w:rFonts w:ascii="Courier New" w:hAnsi="Courier New" w:cs="Courier New" w:hint="default"/>
+      </w:rPr>
+    </w:lvl>
+    <w:lvl w:ilvl="8" w:tplc="08090005" w:tentative="1">
+      <w:start w:val="1"/>
+      <w:numFmt w:val="bullet"/>
+      <w:lvlText w:val=""/>
+      <w:lvlJc w:val="left"/>
+      <w:pPr>
+        <w:ind w:left="6480" w:hanging="360"/>
+      </w:pPr>
+      <w:rPr>
+        <w:rFonts w:ascii="Wingdings" w:hAnsi="Wingdings" w:hint="default"/>
+      </w:rPr>
+    </w:lvl>
+  </w:abstractNum>
+  <w:abstractNum w:abstractNumId="16" w15:restartNumberingAfterBreak="0">
     <w:nsid w:val="6A120399"/>
     <w:multiLevelType w:val="multilevel"/>
     <w:tmpl w:val="6A9E945E"/>
@@ -3216,10 +5631,123 @@
       </w:rPr>
     </w:lvl>
   </w:abstractNum>
-  <w:abstractNum w:abstractNumId="7" w15:restartNumberingAfterBreak="0">
+  <w:abstractNum w:abstractNumId="17" w15:restartNumberingAfterBreak="0">
     <w:nsid w:val="76666B73"/>
     <w:multiLevelType w:val="hybridMultilevel"/>
     <w:tmpl w:val="EA50C182"/>
+    <w:lvl w:ilvl="0" w:tplc="08090001">
+      <w:start w:val="1"/>
+      <w:numFmt w:val="bullet"/>
+      <w:lvlText w:val=""/>
+      <w:lvlJc w:val="left"/>
+      <w:pPr>
+        <w:ind w:left="720" w:hanging="360"/>
+      </w:pPr>
+      <w:rPr>
+        <w:rFonts w:ascii="Symbol" w:hAnsi="Symbol" w:hint="default"/>
+      </w:rPr>
+    </w:lvl>
+    <w:lvl w:ilvl="1" w:tplc="08090003" w:tentative="1">
+      <w:start w:val="1"/>
+      <w:numFmt w:val="bullet"/>
+      <w:lvlText w:val="o"/>
+      <w:lvlJc w:val="left"/>
+      <w:pPr>
+        <w:ind w:left="1440" w:hanging="360"/>
+      </w:pPr>
+      <w:rPr>
+        <w:rFonts w:ascii="Courier New" w:hAnsi="Courier New" w:cs="Courier New" w:hint="default"/>
+      </w:rPr>
+    </w:lvl>
+    <w:lvl w:ilvl="2" w:tplc="08090005" w:tentative="1">
+      <w:start w:val="1"/>
+      <w:numFmt w:val="bullet"/>
+      <w:lvlText w:val=""/>
+      <w:lvlJc w:val="left"/>
+      <w:pPr>
+        <w:ind w:left="2160" w:hanging="360"/>
+      </w:pPr>
+      <w:rPr>
+        <w:rFonts w:ascii="Wingdings" w:hAnsi="Wingdings" w:hint="default"/>
+      </w:rPr>
+    </w:lvl>
+    <w:lvl w:ilvl="3" w:tplc="08090001" w:tentative="1">
+      <w:start w:val="1"/>
+      <w:numFmt w:val="bullet"/>
+      <w:lvlText w:val=""/>
+      <w:lvlJc w:val="left"/>
+      <w:pPr>
+        <w:ind w:left="2880" w:hanging="360"/>
+      </w:pPr>
+      <w:rPr>
+        <w:rFonts w:ascii="Symbol" w:hAnsi="Symbol" w:hint="default"/>
+      </w:rPr>
+    </w:lvl>
+    <w:lvl w:ilvl="4" w:tplc="08090003" w:tentative="1">
+      <w:start w:val="1"/>
+      <w:numFmt w:val="bullet"/>
+      <w:lvlText w:val="o"/>
+      <w:lvlJc w:val="left"/>
+      <w:pPr>
+        <w:ind w:left="3600" w:hanging="360"/>
+      </w:pPr>
+      <w:rPr>
+        <w:rFonts w:ascii="Courier New" w:hAnsi="Courier New" w:cs="Courier New" w:hint="default"/>
+      </w:rPr>
+    </w:lvl>
+    <w:lvl w:ilvl="5" w:tplc="08090005" w:tentative="1">
+      <w:start w:val="1"/>
+      <w:numFmt w:val="bullet"/>
+      <w:lvlText w:val=""/>
+      <w:lvlJc w:val="left"/>
+      <w:pPr>
+        <w:ind w:left="4320" w:hanging="360"/>
+      </w:pPr>
+      <w:rPr>
+        <w:rFonts w:ascii="Wingdings" w:hAnsi="Wingdings" w:hint="default"/>
+      </w:rPr>
+    </w:lvl>
+    <w:lvl w:ilvl="6" w:tplc="08090001" w:tentative="1">
+      <w:start w:val="1"/>
+      <w:numFmt w:val="bullet"/>
+      <w:lvlText w:val=""/>
+      <w:lvlJc w:val="left"/>
+      <w:pPr>
+        <w:ind w:left="5040" w:hanging="360"/>
+      </w:pPr>
+      <w:rPr>
+        <w:rFonts w:ascii="Symbol" w:hAnsi="Symbol" w:hint="default"/>
+      </w:rPr>
+    </w:lvl>
+    <w:lvl w:ilvl="7" w:tplc="08090003" w:tentative="1">
+      <w:start w:val="1"/>
+      <w:numFmt w:val="bullet"/>
+      <w:lvlText w:val="o"/>
+      <w:lvlJc w:val="left"/>
+      <w:pPr>
+        <w:ind w:left="5760" w:hanging="360"/>
+      </w:pPr>
+      <w:rPr>
+        <w:rFonts w:ascii="Courier New" w:hAnsi="Courier New" w:cs="Courier New" w:hint="default"/>
+      </w:rPr>
+    </w:lvl>
+    <w:lvl w:ilvl="8" w:tplc="08090005" w:tentative="1">
+      <w:start w:val="1"/>
+      <w:numFmt w:val="bullet"/>
+      <w:lvlText w:val=""/>
+      <w:lvlJc w:val="left"/>
+      <w:pPr>
+        <w:ind w:left="6480" w:hanging="360"/>
+      </w:pPr>
+      <w:rPr>
+        <w:rFonts w:ascii="Wingdings" w:hAnsi="Wingdings" w:hint="default"/>
+      </w:rPr>
+    </w:lvl>
+  </w:abstractNum>
+  <w:abstractNum w:abstractNumId="18" w15:restartNumberingAfterBreak="0">
+    <w:nsid w:val="7A770358"/>
+    <w:multiLevelType w:val="hybridMultilevel"/>
+    <w:tmpl w:val="F3FA825C"/>
     <w:lvl w:ilvl="0" w:tplc="08090001">
       <w:start w:val="1"/>
       <w:numFmt w:val="bullet"/>
@@ -3333,25 +5861,58 @@
     <w:abstractNumId w:val="1"/>
   </w:num>
   <w:num w:numId="2" w16cid:durableId="1111510578">
-    <w:abstractNumId w:val="2"/>
+    <w:abstractNumId w:val="4"/>
   </w:num>
   <w:num w:numId="3" w16cid:durableId="786587399">
-    <w:abstractNumId w:val="6"/>
+    <w:abstractNumId w:val="16"/>
   </w:num>
   <w:num w:numId="4" w16cid:durableId="319844062">
-    <w:abstractNumId w:val="5"/>
+    <w:abstractNumId w:val="14"/>
   </w:num>
   <w:num w:numId="5" w16cid:durableId="1554005659">
-    <w:abstractNumId w:val="4"/>
+    <w:abstractNumId w:val="11"/>
   </w:num>
   <w:num w:numId="6" w16cid:durableId="1112819657">
-    <w:abstractNumId w:val="3"/>
+    <w:abstractNumId w:val="8"/>
   </w:num>
   <w:num w:numId="7" w16cid:durableId="1211650850">
     <w:abstractNumId w:val="0"/>
   </w:num>
   <w:num w:numId="8" w16cid:durableId="1265768275">
+    <w:abstractNumId w:val="17"/>
+  </w:num>
+  <w:num w:numId="9" w16cid:durableId="980310297">
+    <w:abstractNumId w:val="15"/>
+  </w:num>
+  <w:num w:numId="10" w16cid:durableId="212236533">
+    <w:abstractNumId w:val="3"/>
+  </w:num>
+  <w:num w:numId="11" w16cid:durableId="1968470655">
+    <w:abstractNumId w:val="5"/>
+  </w:num>
+  <w:num w:numId="12" w16cid:durableId="896891322">
+    <w:abstractNumId w:val="6"/>
+  </w:num>
+  <w:num w:numId="13" w16cid:durableId="599877892">
+    <w:abstractNumId w:val="2"/>
+  </w:num>
+  <w:num w:numId="14" w16cid:durableId="893471090">
+    <w:abstractNumId w:val="13"/>
+  </w:num>
+  <w:num w:numId="15" w16cid:durableId="1408263047">
+    <w:abstractNumId w:val="18"/>
+  </w:num>
+  <w:num w:numId="16" w16cid:durableId="1062756973">
     <w:abstractNumId w:val="7"/>
+  </w:num>
+  <w:num w:numId="17" w16cid:durableId="726419796">
+    <w:abstractNumId w:val="12"/>
+  </w:num>
+  <w:num w:numId="18" w16cid:durableId="1673410571">
+    <w:abstractNumId w:val="9"/>
+  </w:num>
+  <w:num w:numId="19" w16cid:durableId="1434322838">
+    <w:abstractNumId w:val="10"/>
   </w:num>
 </w:numbering>
 </file>
@@ -4405,7 +6966,6 @@
     <w:next w:val="Normal"/>
     <w:autoRedefine/>
     <w:uiPriority w:val="39"/>
-    <w:semiHidden/>
     <w:unhideWhenUsed/>
     <w:rsid w:val="005672D5"/>
     <w:pPr>
@@ -4593,6 +7153,95 @@
       <w:bCs/>
     </w:rPr>
   </w:style>
+  <w:style w:type="table" w:styleId="TableGrid">
+    <w:name w:val="Table Grid"/>
+    <w:basedOn w:val="TableNormal"/>
+    <w:uiPriority w:val="39"/>
+    <w:rsid w:val="003D5CE3"/>
+    <w:tblPr>
+      <w:tblBorders>
+        <w:top w:val="single" w:sz="4" w:space="0" w:color="auto"/>
+        <w:left w:val="single" w:sz="4" w:space="0" w:color="auto"/>
+        <w:bottom w:val="single" w:sz="4" w:space="0" w:color="auto"/>
+        <w:right w:val="single" w:sz="4" w:space="0" w:color="auto"/>
+        <w:insideH w:val="single" w:sz="4" w:space="0" w:color="auto"/>
+        <w:insideV w:val="single" w:sz="4" w:space="0" w:color="auto"/>
+      </w:tblBorders>
+    </w:tblPr>
+  </w:style>
+  <w:style w:type="table" w:styleId="GridTable4">
+    <w:name w:val="Grid Table 4"/>
+    <w:basedOn w:val="TableNormal"/>
+    <w:uiPriority w:val="49"/>
+    <w:rsid w:val="007070C2"/>
+    <w:tblPr>
+      <w:tblStyleRowBandSize w:val="1"/>
+      <w:tblStyleColBandSize w:val="1"/>
+      <w:tblBorders>
+        <w:top w:val="single" w:sz="4" w:space="0" w:color="666666" w:themeColor="text1" w:themeTint="99"/>
+        <w:left w:val="single" w:sz="4" w:space="0" w:color="666666" w:themeColor="text1" w:themeTint="99"/>
+        <w:bottom w:val="single" w:sz="4" w:space="0" w:color="666666" w:themeColor="text1" w:themeTint="99"/>
+        <w:right w:val="single" w:sz="4" w:space="0" w:color="666666" w:themeColor="text1" w:themeTint="99"/>
+        <w:insideH w:val="single" w:sz="4" w:space="0" w:color="666666" w:themeColor="text1" w:themeTint="99"/>
+        <w:insideV w:val="single" w:sz="4" w:space="0" w:color="666666" w:themeColor="text1" w:themeTint="99"/>
+      </w:tblBorders>
+    </w:tblPr>
+    <w:tblStylePr w:type="firstRow">
+      <w:rPr>
+        <w:b/>
+        <w:bCs/>
+        <w:color w:val="FFFFFF" w:themeColor="background1"/>
+      </w:rPr>
+      <w:tblPr/>
+      <w:tcPr>
+        <w:tcBorders>
+          <w:top w:val="single" w:sz="4" w:space="0" w:color="000000" w:themeColor="text1"/>
+          <w:left w:val="single" w:sz="4" w:space="0" w:color="000000" w:themeColor="text1"/>
+          <w:bottom w:val="single" w:sz="4" w:space="0" w:color="000000" w:themeColor="text1"/>
+          <w:right w:val="single" w:sz="4" w:space="0" w:color="000000" w:themeColor="text1"/>
+          <w:insideH w:val="nil"/>
+          <w:insideV w:val="nil"/>
+        </w:tcBorders>
+        <w:shd w:val="clear" w:color="auto" w:fill="000000" w:themeFill="text1"/>
+      </w:tcPr>
+    </w:tblStylePr>
+    <w:tblStylePr w:type="lastRow">
+      <w:rPr>
+        <w:b/>
+        <w:bCs/>
+      </w:rPr>
+      <w:tblPr/>
+      <w:tcPr>
+        <w:tcBorders>
+          <w:top w:val="double" w:sz="4" w:space="0" w:color="000000" w:themeColor="text1"/>
+        </w:tcBorders>
+      </w:tcPr>
+    </w:tblStylePr>
+    <w:tblStylePr w:type="firstCol">
+      <w:rPr>
+        <w:b/>
+        <w:bCs/>
+      </w:rPr>
+    </w:tblStylePr>
+    <w:tblStylePr w:type="lastCol">
+      <w:rPr>
+        <w:b/>
+        <w:bCs/>
+      </w:rPr>
+    </w:tblStylePr>
+    <w:tblStylePr w:type="band1Vert">
+      <w:tblPr/>
+      <w:tcPr>
+        <w:shd w:val="clear" w:color="auto" w:fill="CCCCCC" w:themeFill="text1" w:themeFillTint="33"/>
+      </w:tcPr>
+    </w:tblStylePr>
+    <w:tblStylePr w:type="band1Horz">
+      <w:tblPr/>
+      <w:tcPr>
+        <w:shd w:val="clear" w:color="auto" w:fill="CCCCCC" w:themeFill="text1" w:themeFillTint="33"/>
+      </w:tcPr>
+    </w:tblStylePr>
+  </w:style>
 </w:styles>
 </file>
 
@@ -4686,10 +7335,10 @@
   </w:font>
   <w:font w:name="Wingdings">
     <w:panose1 w:val="05000000000000000000"/>
-    <w:charset w:val="02"/>
-    <w:family w:val="auto"/>
+    <w:charset w:val="4D"/>
+    <w:family w:val="decorative"/>
     <w:pitch w:val="variable"/>
-    <w:sig w:usb0="00000000" w:usb1="10000000" w:usb2="00000000" w:usb3="00000000" w:csb0="80000000" w:csb1="00000000"/>
+    <w:sig w:usb0="00000003" w:usb1="00000000" w:usb2="00000000" w:usb3="00000000" w:csb0="80000001" w:csb1="00000000"/>
   </w:font>
   <w:font w:name="Aptos">
     <w:panose1 w:val="020B0004020202020204"/>
@@ -4724,7 +7373,6 @@
   </w:compat>
   <w:rsids>
     <w:rsidRoot w:val="008D3304"/>
-    <w:rsid w:val="001814C7"/>
     <w:rsid w:val="00191BCA"/>
     <w:rsid w:val="003E3EBB"/>
     <w:rsid w:val="00757EF4"/>
@@ -4732,6 +7380,7 @@
     <w:rsid w:val="008D3304"/>
     <w:rsid w:val="0095584E"/>
     <w:rsid w:val="00972862"/>
+    <w:rsid w:val="00D94D1D"/>
   </w:rsids>
   <m:mathPr>
     <m:mathFont m:val="Cambria Math"/>

</xml_diff>